<commit_message>
Corregir nombre de integrante
</commit_message>
<xml_diff>
--- a/LCS_Sprint1_Definition_of_Ready_Done.docx
+++ b/LCS_Sprint1_Definition_of_Ready_Done.docx
@@ -1,6 +1,6 @@
 
 <file path=word/document.xml><?xml version="1.0" encoding="utf-8"?>
-<w:document xmlns:wpc="http://schemas.microsoft.com/office/word/2010/wordprocessingCanvas" xmlns:cx="http://schemas.microsoft.com/office/drawing/2014/chartex" xmlns:cx1="http://schemas.microsoft.com/office/drawing/2015/9/8/chartex" xmlns:cx2="http://schemas.microsoft.com/office/drawing/2015/10/21/chartex" xmlns:cx3="http://schemas.microsoft.com/office/drawing/2016/5/9/chartex" xmlns:cx4="http://schemas.microsoft.com/office/drawing/2016/5/10/chartex" xmlns:cx5="http://schemas.microsoft.com/office/drawing/2016/5/11/chartex" xmlns:cx6="http://schemas.microsoft.com/office/drawing/2016/5/12/chartex" xmlns:cx7="http://schemas.microsoft.com/office/drawing/2016/5/13/chartex" xmlns:cx8="http://schemas.microsoft.com/office/drawing/2016/5/14/chartex" xmlns:mc="http://schemas.openxmlformats.org/markup-compatibility/2006" xmlns:aink="http://schemas.microsoft.com/office/drawing/2016/ink" xmlns:am3d="http://schemas.microsoft.com/office/drawing/2017/model3d" xmlns:o="urn:schemas-microsoft-com:office:office" xmlns:oel="http://schemas.microsoft.com/office/2019/extlst" xmlns:r="http://schemas.openxmlformats.org/officeDocument/2006/relationships" xmlns:m="http://schemas.openxmlformats.org/officeDocument/2006/math" xmlns:v="urn:schemas-microsoft-com:vml" xmlns:wp14="http://schemas.microsoft.com/office/word/2010/wordprocessingDrawing" xmlns:wp="http://schemas.openxmlformats.org/drawingml/2006/wordprocessingDrawing" xmlns:w10="urn:schemas-microsoft-com:office:word" xmlns:w="http://schemas.openxmlformats.org/wordprocessingml/2006/main" xmlns:w14="http://schemas.microsoft.com/office/word/2010/wordml" xmlns:w15="http://schemas.microsoft.com/office/word/2012/wordml" xmlns:w16cei="http://schemas.microsoft.com/office/word/2026/wordml/cei" xmlns:w16cex="http://schemas.microsoft.com/office/word/2018/wordml/cex" xmlns:w16cid="http://schemas.microsoft.com/office/word/2016/wordml/cid" xmlns:w16="http://schemas.microsoft.com/office/word/2018/wordml" xmlns:w16du="http://schemas.microsoft.com/office/word/2023/wordml/word16du" xmlns:w16sdtdh="http://schemas.microsoft.com/office/word/2020/wordml/sdtdatahash" xmlns:w16sdtfl="http://schemas.microsoft.com/office/word/2024/wordml/sdtformatlock" xmlns:w16se="http://schemas.microsoft.com/office/word/2015/wordml/symex" xmlns:wpg="http://schemas.microsoft.com/office/word/2010/wordprocessingGroup" xmlns:wpi="http://schemas.microsoft.com/office/word/2010/wordprocessingInk" xmlns:wne="http://schemas.microsoft.com/office/word/2006/wordml" xmlns:wps="http://schemas.microsoft.com/office/word/2010/wordprocessingShape" mc:Ignorable="w14 w15 w16se w16cid w16 w16cex w16sdtdh w16sdtfl w16du wp14">
+<w:document xmlns:wpc="http://schemas.microsoft.com/office/word/2010/wordprocessingCanvas" xmlns:cx="http://schemas.microsoft.com/office/drawing/2014/chartex" xmlns:cx1="http://schemas.microsoft.com/office/drawing/2015/9/8/chartex" xmlns:cx2="http://schemas.microsoft.com/office/drawing/2015/10/21/chartex" xmlns:cx3="http://schemas.microsoft.com/office/drawing/2016/5/9/chartex" xmlns:cx4="http://schemas.microsoft.com/office/drawing/2016/5/10/chartex" xmlns:cx5="http://schemas.microsoft.com/office/drawing/2016/5/11/chartex" xmlns:cx6="http://schemas.microsoft.com/office/drawing/2016/5/12/chartex" xmlns:cx7="http://schemas.microsoft.com/office/drawing/2016/5/13/chartex" xmlns:cx8="http://schemas.microsoft.com/office/drawing/2016/5/14/chartex" xmlns:mc="http://schemas.openxmlformats.org/markup-compatibility/2006" xmlns:aink="http://schemas.microsoft.com/office/drawing/2016/ink" xmlns:am3d="http://schemas.microsoft.com/office/drawing/2017/model3d" xmlns:o="urn:schemas-microsoft-com:office:office" xmlns:r="http://schemas.openxmlformats.org/officeDocument/2006/relationships" xmlns:m="http://schemas.openxmlformats.org/officeDocument/2006/math" xmlns:v="urn:schemas-microsoft-com:vml" xmlns:wp14="http://schemas.microsoft.com/office/word/2010/wordprocessingDrawing" xmlns:wp="http://schemas.openxmlformats.org/drawingml/2006/wordprocessingDrawing" xmlns:w10="urn:schemas-microsoft-com:office:word" xmlns:w="http://schemas.openxmlformats.org/wordprocessingml/2006/main" xmlns:w14="http://schemas.microsoft.com/office/word/2010/wordml" xmlns:w15="http://schemas.microsoft.com/office/word/2012/wordml" xmlns:w16cex="http://schemas.microsoft.com/office/word/2018/wordml/cex" xmlns:w16cid="http://schemas.microsoft.com/office/word/2016/wordml/cid" xmlns:w16="http://schemas.microsoft.com/office/word/2018/wordml" xmlns:w16sdtdh="http://schemas.microsoft.com/office/word/2020/wordml/sdtdatahash" xmlns:w16se="http://schemas.microsoft.com/office/word/2015/wordml/symex" xmlns:wpg="http://schemas.microsoft.com/office/word/2010/wordprocessingGroup" xmlns:wpi="http://schemas.microsoft.com/office/word/2010/wordprocessingInk" xmlns:wne="http://schemas.microsoft.com/office/word/2006/wordml" xmlns:wps="http://schemas.microsoft.com/office/word/2010/wordprocessingShape" mc:Ignorable="w14 w15 w16se w16cid w16 w16cex w16sdtdh wp14">
   <w:body>
     <w:p>
       <w:pPr>
@@ -161,7 +161,14 @@
                 <w:sz w:val="21"/>
                 <w:lang w:val="es-AR"/>
               </w:rPr>
-              <w:t>¿Me quedo o me voy? — Laboratorio de experimentación, movimiento y física</w:t>
+              <w:t xml:space="preserve">¿Me quedo o me voy? — Laboratorio de </w:t>
+            </w:r>
+            <w:r>
+              <w:rPr>
+                <w:sz w:val="21"/>
+                <w:lang w:val="es-AR"/>
+              </w:rPr>
+              <w:t>experimentación, movimiento y física</w:t>
             </w:r>
           </w:p>
         </w:tc>
@@ -187,13 +194,23 @@
             <w:pPr>
               <w:spacing w:after="0"/>
             </w:pPr>
+            <w:proofErr w:type="spellStart"/>
             <w:r>
               <w:rPr>
                 <w:b/>
                 <w:color w:val="17365D"/>
                 <w:sz w:val="21"/>
               </w:rPr>
-              <w:t xml:space="preserve">Equipo / </w:t>
+              <w:t>Equipo</w:t>
+            </w:r>
+            <w:proofErr w:type="spellEnd"/>
+            <w:r>
+              <w:rPr>
+                <w:b/>
+                <w:color w:val="17365D"/>
+                <w:sz w:val="21"/>
+              </w:rPr>
+              <w:t xml:space="preserve"> / </w:t>
             </w:r>
             <w:proofErr w:type="spellStart"/>
             <w:r>
@@ -230,7 +247,21 @@
                 <w:sz w:val="21"/>
                 <w:lang w:val="es-AR"/>
               </w:rPr>
-              <w:t>Ulises Fonseca - Lucas Huber - N</w:t>
+              <w:t xml:space="preserve">Ulises Fonseca - Lucas Huber </w:t>
+            </w:r>
+            <w:r>
+              <w:rPr>
+                <w:sz w:val="21"/>
+                <w:lang w:val="es-AR"/>
+              </w:rPr>
+              <w:t>–</w:t>
+            </w:r>
+            <w:r>
+              <w:rPr>
+                <w:sz w:val="21"/>
+                <w:lang w:val="es-AR"/>
+              </w:rPr>
+              <w:t xml:space="preserve"> N</w:t>
             </w:r>
             <w:r>
               <w:rPr>
@@ -238,6 +269,13 @@
                 <w:lang w:val="es-AR"/>
               </w:rPr>
               <w:t>ico</w:t>
+            </w:r>
+            <w:r>
+              <w:rPr>
+                <w:sz w:val="21"/>
+                <w:lang w:val="es-AR"/>
+              </w:rPr>
+              <w:t>las Gauna</w:t>
             </w:r>
           </w:p>
         </w:tc>
@@ -484,7 +522,7 @@
     </w:p>
     <w:p>
       <w:pPr>
-        <w:pStyle w:val="Heading1"/>
+        <w:pStyle w:val="Ttulo1"/>
         <w:rPr>
           <w:lang w:val="es-AR"/>
         </w:rPr>
@@ -494,7 +532,13 @@
           <w:lang w:val="es-AR"/>
         </w:rPr>
         <w:lastRenderedPageBreak/>
-        <w:t>1. Objetivo del documento</w:t>
+        <w:t xml:space="preserve">1. </w:t>
+      </w:r>
+      <w:r>
+        <w:rPr>
+          <w:lang w:val="es-AR"/>
+        </w:rPr>
+        <w:t>Objetivo del documento</w:t>
       </w:r>
     </w:p>
     <w:p>
@@ -539,8 +583,17 @@
           <w:b/>
           <w:lang w:val="es-AR"/>
         </w:rPr>
-        <w:t xml:space="preserve"> Ready</w:t>
+        <w:t xml:space="preserve"> </w:t>
       </w:r>
+      <w:proofErr w:type="spellStart"/>
+      <w:r>
+        <w:rPr>
+          <w:b/>
+          <w:lang w:val="es-AR"/>
+        </w:rPr>
+        <w:t>Ready</w:t>
+      </w:r>
+      <w:proofErr w:type="spellEnd"/>
       <w:r>
         <w:rPr>
           <w:lang w:val="es-AR"/>
@@ -583,7 +636,13 @@
         <w:rPr>
           <w:lang w:val="es-AR"/>
         </w:rPr>
-        <w:t>). La consigna del trabajo práctico exige que el equipo defina ambos acuerdos como parte de su proceso de trabajo durante el proyecto.</w:t>
+        <w:t>). La consigna del trabajo práct</w:t>
+      </w:r>
+      <w:r>
+        <w:rPr>
+          <w:lang w:val="es-AR"/>
+        </w:rPr>
+        <w:t>ico exige que el equipo defina ambos acuerdos como parte de su proceso de trabajo durante el proyecto.</w:t>
       </w:r>
     </w:p>
     <w:p>
@@ -603,7 +662,13 @@
         <w:rPr>
           <w:lang w:val="es-AR"/>
         </w:rPr>
-        <w:t xml:space="preserve">No reemplazan los criterios de aceptación de las funcionalidades: los criterios de aceptación son específicos de cada </w:t>
+        <w:t>No reemplazan los criterios de aceptación de las funcionalidades: los criterios de aceptación son específic</w:t>
+      </w:r>
+      <w:r>
+        <w:rPr>
+          <w:lang w:val="es-AR"/>
+        </w:rPr>
+        <w:t xml:space="preserve">os de cada </w:t>
       </w:r>
       <w:proofErr w:type="spellStart"/>
       <w:r>
@@ -636,7 +701,7 @@
     </w:p>
     <w:p>
       <w:pPr>
-        <w:pStyle w:val="Heading1"/>
+        <w:pStyle w:val="Ttulo1"/>
         <w:rPr>
           <w:lang w:val="es-AR"/>
         </w:rPr>
@@ -673,8 +738,16 @@
         <w:rPr>
           <w:lang w:val="es-AR"/>
         </w:rPr>
-        <w:t xml:space="preserve"> Ready</w:t>
+        <w:t xml:space="preserve"> </w:t>
       </w:r>
+      <w:proofErr w:type="spellStart"/>
+      <w:r>
+        <w:rPr>
+          <w:lang w:val="es-AR"/>
+        </w:rPr>
+        <w:t>Ready</w:t>
+      </w:r>
+      <w:proofErr w:type="spellEnd"/>
     </w:p>
     <w:p>
       <w:pPr>
@@ -834,7 +907,14 @@
                 <w:b/>
                 <w:sz w:val="19"/>
               </w:rPr>
-              <w:t>Objetivo y descripción claros</w:t>
+              <w:t xml:space="preserve">Objetivo y </w:t>
+            </w:r>
+            <w:r>
+              <w:rPr>
+                <w:b/>
+                <w:sz w:val="19"/>
+              </w:rPr>
+              <w:t>descripción claros</w:t>
             </w:r>
           </w:p>
         </w:tc>
@@ -945,7 +1025,14 @@
                 <w:sz w:val="19"/>
                 <w:lang w:val="es-AR"/>
               </w:rPr>
-              <w:t>Si la tarea representa una funcionalidad del producto, cuenta con criterios de aceptación definidos.</w:t>
+              <w:t>Si la tarea representa una funcionalidad del producto, cuenta con criteri</w:t>
+            </w:r>
+            <w:r>
+              <w:rPr>
+                <w:sz w:val="19"/>
+                <w:lang w:val="es-AR"/>
+              </w:rPr>
+              <w:t>os de aceptación definidos.</w:t>
             </w:r>
           </w:p>
         </w:tc>
@@ -1104,7 +1191,14 @@
                 <w:sz w:val="19"/>
                 <w:lang w:val="es-AR"/>
               </w:rPr>
-              <w:t>La tarea cuenta con información suficiente para poder comenzar. Las dudas que no bloqueen el inicio pueden investigarse y resolverse durante su desarrollo.</w:t>
+              <w:t xml:space="preserve">La tarea cuenta con información suficiente para poder </w:t>
+            </w:r>
+            <w:r>
+              <w:rPr>
+                <w:sz w:val="19"/>
+                <w:lang w:val="es-AR"/>
+              </w:rPr>
+              <w:t>comenzar. Las dudas que no bloqueen el inicio pueden investigarse y resolverse durante su desarrollo.</w:t>
             </w:r>
           </w:p>
         </w:tc>
@@ -1190,7 +1284,7 @@
     </w:tbl>
     <w:p>
       <w:pPr>
-        <w:pStyle w:val="Heading2"/>
+        <w:pStyle w:val="Ttulo2"/>
         <w:rPr>
           <w:lang w:val="es-AR"/>
         </w:rPr>
@@ -1219,7 +1313,13 @@
         <w:rPr>
           <w:lang w:val="es-AR"/>
         </w:rPr>
-        <w:t>Si falta información que impide iniciar el trabajo, la tarea deberá aclararse antes de pasar a En curso. Si existen dudas menores que pueden resolverse investigando durante la ejecución, la tarea puede considerarse Ready.</w:t>
+        <w:t>Si falta información que impide iniciar el trabajo, la tarea deberá aclararse antes de pasar a En curso. Si existen dudas menores que pueden resolverse investigando durante la ejecución, la</w:t>
+      </w:r>
+      <w:r>
+        <w:rPr>
+          <w:lang w:val="es-AR"/>
+        </w:rPr>
+        <w:t xml:space="preserve"> tarea puede considerarse Ready.</w:t>
       </w:r>
     </w:p>
     <w:p>
@@ -1246,7 +1346,7 @@
     </w:p>
     <w:p>
       <w:pPr>
-        <w:pStyle w:val="Heading1"/>
+        <w:pStyle w:val="Ttulo1"/>
         <w:rPr>
           <w:lang w:val="es-AR"/>
         </w:rPr>
@@ -1470,7 +1570,14 @@
                 <w:sz w:val="19"/>
                 <w:lang w:val="es-AR"/>
               </w:rPr>
-              <w:t>Se completó el trabajo definido y el resultado responde al objetivo de la tarea.</w:t>
+              <w:t xml:space="preserve">Se completó el trabajo definido y el resultado responde al objetivo de la </w:t>
+            </w:r>
+            <w:r>
+              <w:rPr>
+                <w:sz w:val="19"/>
+                <w:lang w:val="es-AR"/>
+              </w:rPr>
+              <w:t>tarea.</w:t>
             </w:r>
           </w:p>
         </w:tc>
@@ -1629,7 +1736,14 @@
                 <w:sz w:val="19"/>
                 <w:lang w:val="es-AR"/>
               </w:rPr>
-              <w:t>El resultado fue probado o verificado de una forma acorde al tipo de tarea y, cuando corresponda, el resultado quedó registrado.</w:t>
+              <w:t xml:space="preserve">El resultado fue probado o verificado de una forma acorde al tipo de tarea y, cuando corresponda, el </w:t>
+            </w:r>
+            <w:r>
+              <w:rPr>
+                <w:sz w:val="19"/>
+                <w:lang w:val="es-AR"/>
+              </w:rPr>
+              <w:t>resultado quedó registrado.</w:t>
             </w:r>
           </w:p>
         </w:tc>
@@ -1788,7 +1902,14 @@
                 <w:sz w:val="19"/>
                 <w:lang w:val="es-AR"/>
               </w:rPr>
-              <w:t>Si hubo cambios en el código o en el proyecto, estos quedaron guardados correctamente en el repositorio Git.</w:t>
+              <w:t xml:space="preserve">Si hubo cambios en el código o en el </w:t>
+            </w:r>
+            <w:r>
+              <w:rPr>
+                <w:sz w:val="19"/>
+                <w:lang w:val="es-AR"/>
+              </w:rPr>
+              <w:t>proyecto, estos quedaron guardados correctamente en el repositorio Git.</w:t>
             </w:r>
           </w:p>
         </w:tc>
@@ -1921,7 +2042,14 @@
                 <w:b/>
                 <w:sz w:val="19"/>
               </w:rPr>
-              <w:t>Estado actualizado en Jira</w:t>
+              <w:t>Estado actualizado en</w:t>
+            </w:r>
+            <w:r>
+              <w:rPr>
+                <w:b/>
+                <w:sz w:val="19"/>
+              </w:rPr>
+              <w:t xml:space="preserve"> Jira</w:t>
             </w:r>
           </w:p>
         </w:tc>
@@ -1955,7 +2083,7 @@
     </w:tbl>
     <w:p>
       <w:pPr>
-        <w:pStyle w:val="Heading2"/>
+        <w:pStyle w:val="Ttulo2"/>
         <w:rPr>
           <w:lang w:val="es-AR"/>
         </w:rPr>
@@ -1984,12 +2112,18 @@
         <w:rPr>
           <w:lang w:val="es-AR"/>
         </w:rPr>
-        <w:t>Antes de cerrarla, el equipo comprobará los criterios anteriores. Los criterios que no correspondan al tipo de tarea —por ejemplo, Git en una tarea exclusivamente organizativa— se consideran no aplicables.</w:t>
+        <w:t>Antes de cerrarla, el equipo comprobará los criterios anteriores. Los criterios que no correspondan al tipo de tarea —por ejemplo, Git en una tarea exclusivamente organizativa— se consider</w:t>
+      </w:r>
+      <w:r>
+        <w:rPr>
+          <w:lang w:val="es-AR"/>
+        </w:rPr>
+        <w:t>an no aplicables.</w:t>
       </w:r>
     </w:p>
     <w:p>
       <w:pPr>
-        <w:pStyle w:val="Heading1"/>
+        <w:pStyle w:val="Ttulo1"/>
         <w:rPr>
           <w:lang w:val="es-AR"/>
         </w:rPr>
@@ -2018,7 +2152,13 @@
         <w:rPr>
           <w:lang w:val="es-AR"/>
         </w:rPr>
-        <w:t xml:space="preserve">Por ejemplo, una historia relacionada con el salto puede exigir que el personaje pueda saltar desde una superficie válida, que la gravedad lo devuelva al suelo y que no existan saltos infinitos no deseados. El </w:t>
+        <w:t xml:space="preserve">Por ejemplo, una historia relacionada con el salto puede exigir que el personaje pueda saltar desde una superficie válida, que </w:t>
+      </w:r>
+      <w:r>
+        <w:rPr>
+          <w:lang w:val="es-AR"/>
+        </w:rPr>
+        <w:t xml:space="preserve">la gravedad lo devuelva al suelo y que no existan saltos infinitos no deseados. El </w:t>
       </w:r>
       <w:proofErr w:type="spellStart"/>
       <w:r>
@@ -2051,7 +2191,7 @@
     </w:p>
     <w:p>
       <w:pPr>
-        <w:pStyle w:val="Heading1"/>
+        <w:pStyle w:val="Ttulo1"/>
         <w:rPr>
           <w:lang w:val="es-AR"/>
         </w:rPr>
@@ -2060,7 +2200,13 @@
         <w:rPr>
           <w:lang w:val="es-AR"/>
         </w:rPr>
-        <w:t>5. Acuerdo del equipo</w:t>
+        <w:t>5. Ac</w:t>
+      </w:r>
+      <w:r>
+        <w:rPr>
+          <w:lang w:val="es-AR"/>
+        </w:rPr>
+        <w:t>uerdo del equipo</w:t>
       </w:r>
     </w:p>
     <w:p>
@@ -2103,7 +2249,7 @@
 </file>
 
 <file path=word/endnotes.xml><?xml version="1.0" encoding="utf-8"?>
-<w:endnotes xmlns:wpc="http://schemas.microsoft.com/office/word/2010/wordprocessingCanvas" xmlns:cx="http://schemas.microsoft.com/office/drawing/2014/chartex" xmlns:cx1="http://schemas.microsoft.com/office/drawing/2015/9/8/chartex" xmlns:cx2="http://schemas.microsoft.com/office/drawing/2015/10/21/chartex" xmlns:cx3="http://schemas.microsoft.com/office/drawing/2016/5/9/chartex" xmlns:cx4="http://schemas.microsoft.com/office/drawing/2016/5/10/chartex" xmlns:cx5="http://schemas.microsoft.com/office/drawing/2016/5/11/chartex" xmlns:cx6="http://schemas.microsoft.com/office/drawing/2016/5/12/chartex" xmlns:cx7="http://schemas.microsoft.com/office/drawing/2016/5/13/chartex" xmlns:cx8="http://schemas.microsoft.com/office/drawing/2016/5/14/chartex" xmlns:mc="http://schemas.openxmlformats.org/markup-compatibility/2006" xmlns:aink="http://schemas.microsoft.com/office/drawing/2016/ink" xmlns:am3d="http://schemas.microsoft.com/office/drawing/2017/model3d" xmlns:o="urn:schemas-microsoft-com:office:office" xmlns:oel="http://schemas.microsoft.com/office/2019/extlst" xmlns:r="http://schemas.openxmlformats.org/officeDocument/2006/relationships" xmlns:m="http://schemas.openxmlformats.org/officeDocument/2006/math" xmlns:v="urn:schemas-microsoft-com:vml" xmlns:wp14="http://schemas.microsoft.com/office/word/2010/wordprocessingDrawing" xmlns:wp="http://schemas.openxmlformats.org/drawingml/2006/wordprocessingDrawing" xmlns:w10="urn:schemas-microsoft-com:office:word" xmlns:w="http://schemas.openxmlformats.org/wordprocessingml/2006/main" xmlns:w14="http://schemas.microsoft.com/office/word/2010/wordml" xmlns:w15="http://schemas.microsoft.com/office/word/2012/wordml" xmlns:w16cei="http://schemas.microsoft.com/office/word/2026/wordml/cei" xmlns:w16cex="http://schemas.microsoft.com/office/word/2018/wordml/cex" xmlns:w16cid="http://schemas.microsoft.com/office/word/2016/wordml/cid" xmlns:w16="http://schemas.microsoft.com/office/word/2018/wordml" xmlns:w16du="http://schemas.microsoft.com/office/word/2023/wordml/word16du" xmlns:w16sdtdh="http://schemas.microsoft.com/office/word/2020/wordml/sdtdatahash" xmlns:w16sdtfl="http://schemas.microsoft.com/office/word/2024/wordml/sdtformatlock" xmlns:w16se="http://schemas.microsoft.com/office/word/2015/wordml/symex" xmlns:wpg="http://schemas.microsoft.com/office/word/2010/wordprocessingGroup" xmlns:wpi="http://schemas.microsoft.com/office/word/2010/wordprocessingInk" xmlns:wne="http://schemas.microsoft.com/office/word/2006/wordml" xmlns:wps="http://schemas.microsoft.com/office/word/2010/wordprocessingShape" mc:Ignorable="w14 w15 w16se w16cid w16 w16cex w16sdtdh w16sdtfl w16du wp14">
+<w:endnotes xmlns:wpc="http://schemas.microsoft.com/office/word/2010/wordprocessingCanvas" xmlns:cx="http://schemas.microsoft.com/office/drawing/2014/chartex" xmlns:cx1="http://schemas.microsoft.com/office/drawing/2015/9/8/chartex" xmlns:cx2="http://schemas.microsoft.com/office/drawing/2015/10/21/chartex" xmlns:cx3="http://schemas.microsoft.com/office/drawing/2016/5/9/chartex" xmlns:cx4="http://schemas.microsoft.com/office/drawing/2016/5/10/chartex" xmlns:cx5="http://schemas.microsoft.com/office/drawing/2016/5/11/chartex" xmlns:cx6="http://schemas.microsoft.com/office/drawing/2016/5/12/chartex" xmlns:cx7="http://schemas.microsoft.com/office/drawing/2016/5/13/chartex" xmlns:cx8="http://schemas.microsoft.com/office/drawing/2016/5/14/chartex" xmlns:mc="http://schemas.openxmlformats.org/markup-compatibility/2006" xmlns:aink="http://schemas.microsoft.com/office/drawing/2016/ink" xmlns:am3d="http://schemas.microsoft.com/office/drawing/2017/model3d" xmlns:o="urn:schemas-microsoft-com:office:office" xmlns:r="http://schemas.openxmlformats.org/officeDocument/2006/relationships" xmlns:m="http://schemas.openxmlformats.org/officeDocument/2006/math" xmlns:v="urn:schemas-microsoft-com:vml" xmlns:wp14="http://schemas.microsoft.com/office/word/2010/wordprocessingDrawing" xmlns:wp="http://schemas.openxmlformats.org/drawingml/2006/wordprocessingDrawing" xmlns:w10="urn:schemas-microsoft-com:office:word" xmlns:w="http://schemas.openxmlformats.org/wordprocessingml/2006/main" xmlns:w14="http://schemas.microsoft.com/office/word/2010/wordml" xmlns:w15="http://schemas.microsoft.com/office/word/2012/wordml" xmlns:w16cex="http://schemas.microsoft.com/office/word/2018/wordml/cex" xmlns:w16cid="http://schemas.microsoft.com/office/word/2016/wordml/cid" xmlns:w16="http://schemas.microsoft.com/office/word/2018/wordml" xmlns:w16sdtdh="http://schemas.microsoft.com/office/word/2020/wordml/sdtdatahash" xmlns:w16se="http://schemas.microsoft.com/office/word/2015/wordml/symex" xmlns:wpg="http://schemas.microsoft.com/office/word/2010/wordprocessingGroup" xmlns:wpi="http://schemas.microsoft.com/office/word/2010/wordprocessingInk" xmlns:wne="http://schemas.microsoft.com/office/word/2006/wordml" xmlns:wps="http://schemas.microsoft.com/office/word/2010/wordprocessingShape" mc:Ignorable="w14 w15 w16se w16cid w16 w16cex w16sdtdh wp14">
   <w:endnote w:type="separator" w:id="-1">
     <w:p>
       <w:pPr>
@@ -2128,10 +2274,10 @@
 </file>
 
 <file path=word/footer1.xml><?xml version="1.0" encoding="utf-8"?>
-<w:ftr xmlns:wpc="http://schemas.microsoft.com/office/word/2010/wordprocessingCanvas" xmlns:cx="http://schemas.microsoft.com/office/drawing/2014/chartex" xmlns:cx1="http://schemas.microsoft.com/office/drawing/2015/9/8/chartex" xmlns:cx2="http://schemas.microsoft.com/office/drawing/2015/10/21/chartex" xmlns:cx3="http://schemas.microsoft.com/office/drawing/2016/5/9/chartex" xmlns:cx4="http://schemas.microsoft.com/office/drawing/2016/5/10/chartex" xmlns:cx5="http://schemas.microsoft.com/office/drawing/2016/5/11/chartex" xmlns:cx6="http://schemas.microsoft.com/office/drawing/2016/5/12/chartex" xmlns:cx7="http://schemas.microsoft.com/office/drawing/2016/5/13/chartex" xmlns:cx8="http://schemas.microsoft.com/office/drawing/2016/5/14/chartex" xmlns:mc="http://schemas.openxmlformats.org/markup-compatibility/2006" xmlns:aink="http://schemas.microsoft.com/office/drawing/2016/ink" xmlns:am3d="http://schemas.microsoft.com/office/drawing/2017/model3d" xmlns:o="urn:schemas-microsoft-com:office:office" xmlns:oel="http://schemas.microsoft.com/office/2019/extlst" xmlns:r="http://schemas.openxmlformats.org/officeDocument/2006/relationships" xmlns:m="http://schemas.openxmlformats.org/officeDocument/2006/math" xmlns:v="urn:schemas-microsoft-com:vml" xmlns:wp14="http://schemas.microsoft.com/office/word/2010/wordprocessingDrawing" xmlns:wp="http://schemas.openxmlformats.org/drawingml/2006/wordprocessingDrawing" xmlns:w10="urn:schemas-microsoft-com:office:word" xmlns:w="http://schemas.openxmlformats.org/wordprocessingml/2006/main" xmlns:w14="http://schemas.microsoft.com/office/word/2010/wordml" xmlns:w15="http://schemas.microsoft.com/office/word/2012/wordml" xmlns:w16cei="http://schemas.microsoft.com/office/word/2026/wordml/cei" xmlns:w16cex="http://schemas.microsoft.com/office/word/2018/wordml/cex" xmlns:w16cid="http://schemas.microsoft.com/office/word/2016/wordml/cid" xmlns:w16="http://schemas.microsoft.com/office/word/2018/wordml" xmlns:w16du="http://schemas.microsoft.com/office/word/2023/wordml/word16du" xmlns:w16sdtdh="http://schemas.microsoft.com/office/word/2020/wordml/sdtdatahash" xmlns:w16sdtfl="http://schemas.microsoft.com/office/word/2024/wordml/sdtformatlock" xmlns:w16se="http://schemas.microsoft.com/office/word/2015/wordml/symex" xmlns:wpg="http://schemas.microsoft.com/office/word/2010/wordprocessingGroup" xmlns:wpi="http://schemas.microsoft.com/office/word/2010/wordprocessingInk" xmlns:wne="http://schemas.microsoft.com/office/word/2006/wordml" xmlns:wps="http://schemas.microsoft.com/office/word/2010/wordprocessingShape" mc:Ignorable="w14 w15 w16se w16cid w16 w16cex w16sdtdh w16sdtfl w16du wp14">
+<w:ftr xmlns:wpc="http://schemas.microsoft.com/office/word/2010/wordprocessingCanvas" xmlns:cx="http://schemas.microsoft.com/office/drawing/2014/chartex" xmlns:cx1="http://schemas.microsoft.com/office/drawing/2015/9/8/chartex" xmlns:cx2="http://schemas.microsoft.com/office/drawing/2015/10/21/chartex" xmlns:cx3="http://schemas.microsoft.com/office/drawing/2016/5/9/chartex" xmlns:cx4="http://schemas.microsoft.com/office/drawing/2016/5/10/chartex" xmlns:cx5="http://schemas.microsoft.com/office/drawing/2016/5/11/chartex" xmlns:cx6="http://schemas.microsoft.com/office/drawing/2016/5/12/chartex" xmlns:cx7="http://schemas.microsoft.com/office/drawing/2016/5/13/chartex" xmlns:cx8="http://schemas.microsoft.com/office/drawing/2016/5/14/chartex" xmlns:mc="http://schemas.openxmlformats.org/markup-compatibility/2006" xmlns:aink="http://schemas.microsoft.com/office/drawing/2016/ink" xmlns:am3d="http://schemas.microsoft.com/office/drawing/2017/model3d" xmlns:o="urn:schemas-microsoft-com:office:office" xmlns:r="http://schemas.openxmlformats.org/officeDocument/2006/relationships" xmlns:m="http://schemas.openxmlformats.org/officeDocument/2006/math" xmlns:v="urn:schemas-microsoft-com:vml" xmlns:wp14="http://schemas.microsoft.com/office/word/2010/wordprocessingDrawing" xmlns:wp="http://schemas.openxmlformats.org/drawingml/2006/wordprocessingDrawing" xmlns:w10="urn:schemas-microsoft-com:office:word" xmlns:w="http://schemas.openxmlformats.org/wordprocessingml/2006/main" xmlns:w14="http://schemas.microsoft.com/office/word/2010/wordml" xmlns:w15="http://schemas.microsoft.com/office/word/2012/wordml" xmlns:w16cex="http://schemas.microsoft.com/office/word/2018/wordml/cex" xmlns:w16cid="http://schemas.microsoft.com/office/word/2016/wordml/cid" xmlns:w16="http://schemas.microsoft.com/office/word/2018/wordml" xmlns:w16sdtdh="http://schemas.microsoft.com/office/word/2020/wordml/sdtdatahash" xmlns:w16se="http://schemas.microsoft.com/office/word/2015/wordml/symex" xmlns:wpg="http://schemas.microsoft.com/office/word/2010/wordprocessingGroup" xmlns:wpi="http://schemas.microsoft.com/office/word/2010/wordprocessingInk" xmlns:wne="http://schemas.microsoft.com/office/word/2006/wordml" xmlns:wps="http://schemas.microsoft.com/office/word/2010/wordprocessingShape" mc:Ignorable="w14 w15 w16se w16cid w16 w16cex w16sdtdh wp14">
   <w:p>
     <w:pPr>
-      <w:pStyle w:val="Footer"/>
+      <w:pStyle w:val="Piedepgina"/>
       <w:jc w:val="right"/>
     </w:pPr>
     <w:r>
@@ -2183,7 +2329,7 @@
 </file>
 
 <file path=word/footnotes.xml><?xml version="1.0" encoding="utf-8"?>
-<w:footnotes xmlns:wpc="http://schemas.microsoft.com/office/word/2010/wordprocessingCanvas" xmlns:cx="http://schemas.microsoft.com/office/drawing/2014/chartex" xmlns:cx1="http://schemas.microsoft.com/office/drawing/2015/9/8/chartex" xmlns:cx2="http://schemas.microsoft.com/office/drawing/2015/10/21/chartex" xmlns:cx3="http://schemas.microsoft.com/office/drawing/2016/5/9/chartex" xmlns:cx4="http://schemas.microsoft.com/office/drawing/2016/5/10/chartex" xmlns:cx5="http://schemas.microsoft.com/office/drawing/2016/5/11/chartex" xmlns:cx6="http://schemas.microsoft.com/office/drawing/2016/5/12/chartex" xmlns:cx7="http://schemas.microsoft.com/office/drawing/2016/5/13/chartex" xmlns:cx8="http://schemas.microsoft.com/office/drawing/2016/5/14/chartex" xmlns:mc="http://schemas.openxmlformats.org/markup-compatibility/2006" xmlns:aink="http://schemas.microsoft.com/office/drawing/2016/ink" xmlns:am3d="http://schemas.microsoft.com/office/drawing/2017/model3d" xmlns:o="urn:schemas-microsoft-com:office:office" xmlns:oel="http://schemas.microsoft.com/office/2019/extlst" xmlns:r="http://schemas.openxmlformats.org/officeDocument/2006/relationships" xmlns:m="http://schemas.openxmlformats.org/officeDocument/2006/math" xmlns:v="urn:schemas-microsoft-com:vml" xmlns:wp14="http://schemas.microsoft.com/office/word/2010/wordprocessingDrawing" xmlns:wp="http://schemas.openxmlformats.org/drawingml/2006/wordprocessingDrawing" xmlns:w10="urn:schemas-microsoft-com:office:word" xmlns:w="http://schemas.openxmlformats.org/wordprocessingml/2006/main" xmlns:w14="http://schemas.microsoft.com/office/word/2010/wordml" xmlns:w15="http://schemas.microsoft.com/office/word/2012/wordml" xmlns:w16cei="http://schemas.microsoft.com/office/word/2026/wordml/cei" xmlns:w16cex="http://schemas.microsoft.com/office/word/2018/wordml/cex" xmlns:w16cid="http://schemas.microsoft.com/office/word/2016/wordml/cid" xmlns:w16="http://schemas.microsoft.com/office/word/2018/wordml" xmlns:w16du="http://schemas.microsoft.com/office/word/2023/wordml/word16du" xmlns:w16sdtdh="http://schemas.microsoft.com/office/word/2020/wordml/sdtdatahash" xmlns:w16sdtfl="http://schemas.microsoft.com/office/word/2024/wordml/sdtformatlock" xmlns:w16se="http://schemas.microsoft.com/office/word/2015/wordml/symex" xmlns:wpg="http://schemas.microsoft.com/office/word/2010/wordprocessingGroup" xmlns:wpi="http://schemas.microsoft.com/office/word/2010/wordprocessingInk" xmlns:wne="http://schemas.microsoft.com/office/word/2006/wordml" xmlns:wps="http://schemas.microsoft.com/office/word/2010/wordprocessingShape" mc:Ignorable="w14 w15 w16se w16cid w16 w16cex w16sdtdh w16sdtfl w16du wp14">
+<w:footnotes xmlns:wpc="http://schemas.microsoft.com/office/word/2010/wordprocessingCanvas" xmlns:cx="http://schemas.microsoft.com/office/drawing/2014/chartex" xmlns:cx1="http://schemas.microsoft.com/office/drawing/2015/9/8/chartex" xmlns:cx2="http://schemas.microsoft.com/office/drawing/2015/10/21/chartex" xmlns:cx3="http://schemas.microsoft.com/office/drawing/2016/5/9/chartex" xmlns:cx4="http://schemas.microsoft.com/office/drawing/2016/5/10/chartex" xmlns:cx5="http://schemas.microsoft.com/office/drawing/2016/5/11/chartex" xmlns:cx6="http://schemas.microsoft.com/office/drawing/2016/5/12/chartex" xmlns:cx7="http://schemas.microsoft.com/office/drawing/2016/5/13/chartex" xmlns:cx8="http://schemas.microsoft.com/office/drawing/2016/5/14/chartex" xmlns:mc="http://schemas.openxmlformats.org/markup-compatibility/2006" xmlns:aink="http://schemas.microsoft.com/office/drawing/2016/ink" xmlns:am3d="http://schemas.microsoft.com/office/drawing/2017/model3d" xmlns:o="urn:schemas-microsoft-com:office:office" xmlns:r="http://schemas.openxmlformats.org/officeDocument/2006/relationships" xmlns:m="http://schemas.openxmlformats.org/officeDocument/2006/math" xmlns:v="urn:schemas-microsoft-com:vml" xmlns:wp14="http://schemas.microsoft.com/office/word/2010/wordprocessingDrawing" xmlns:wp="http://schemas.openxmlformats.org/drawingml/2006/wordprocessingDrawing" xmlns:w10="urn:schemas-microsoft-com:office:word" xmlns:w="http://schemas.openxmlformats.org/wordprocessingml/2006/main" xmlns:w14="http://schemas.microsoft.com/office/word/2010/wordml" xmlns:w15="http://schemas.microsoft.com/office/word/2012/wordml" xmlns:w16cex="http://schemas.microsoft.com/office/word/2018/wordml/cex" xmlns:w16cid="http://schemas.microsoft.com/office/word/2016/wordml/cid" xmlns:w16="http://schemas.microsoft.com/office/word/2018/wordml" xmlns:w16sdtdh="http://schemas.microsoft.com/office/word/2020/wordml/sdtdatahash" xmlns:w16se="http://schemas.microsoft.com/office/word/2015/wordml/symex" xmlns:wpg="http://schemas.microsoft.com/office/word/2010/wordprocessingGroup" xmlns:wpi="http://schemas.microsoft.com/office/word/2010/wordprocessingInk" xmlns:wne="http://schemas.microsoft.com/office/word/2006/wordml" xmlns:wps="http://schemas.microsoft.com/office/word/2010/wordprocessingShape" mc:Ignorable="w14 w15 w16se w16cid w16 w16cex w16sdtdh wp14">
   <w:footnote w:type="separator" w:id="-1">
     <w:p>
       <w:pPr>
@@ -2208,10 +2354,10 @@
 </file>
 
 <file path=word/header1.xml><?xml version="1.0" encoding="utf-8"?>
-<w:hdr xmlns:wpc="http://schemas.microsoft.com/office/word/2010/wordprocessingCanvas" xmlns:cx="http://schemas.microsoft.com/office/drawing/2014/chartex" xmlns:cx1="http://schemas.microsoft.com/office/drawing/2015/9/8/chartex" xmlns:cx2="http://schemas.microsoft.com/office/drawing/2015/10/21/chartex" xmlns:cx3="http://schemas.microsoft.com/office/drawing/2016/5/9/chartex" xmlns:cx4="http://schemas.microsoft.com/office/drawing/2016/5/10/chartex" xmlns:cx5="http://schemas.microsoft.com/office/drawing/2016/5/11/chartex" xmlns:cx6="http://schemas.microsoft.com/office/drawing/2016/5/12/chartex" xmlns:cx7="http://schemas.microsoft.com/office/drawing/2016/5/13/chartex" xmlns:cx8="http://schemas.microsoft.com/office/drawing/2016/5/14/chartex" xmlns:mc="http://schemas.openxmlformats.org/markup-compatibility/2006" xmlns:aink="http://schemas.microsoft.com/office/drawing/2016/ink" xmlns:am3d="http://schemas.microsoft.com/office/drawing/2017/model3d" xmlns:o="urn:schemas-microsoft-com:office:office" xmlns:oel="http://schemas.microsoft.com/office/2019/extlst" xmlns:r="http://schemas.openxmlformats.org/officeDocument/2006/relationships" xmlns:m="http://schemas.openxmlformats.org/officeDocument/2006/math" xmlns:v="urn:schemas-microsoft-com:vml" xmlns:wp14="http://schemas.microsoft.com/office/word/2010/wordprocessingDrawing" xmlns:wp="http://schemas.openxmlformats.org/drawingml/2006/wordprocessingDrawing" xmlns:w10="urn:schemas-microsoft-com:office:word" xmlns:w="http://schemas.openxmlformats.org/wordprocessingml/2006/main" xmlns:w14="http://schemas.microsoft.com/office/word/2010/wordml" xmlns:w15="http://schemas.microsoft.com/office/word/2012/wordml" xmlns:w16cei="http://schemas.microsoft.com/office/word/2026/wordml/cei" xmlns:w16cex="http://schemas.microsoft.com/office/word/2018/wordml/cex" xmlns:w16cid="http://schemas.microsoft.com/office/word/2016/wordml/cid" xmlns:w16="http://schemas.microsoft.com/office/word/2018/wordml" xmlns:w16du="http://schemas.microsoft.com/office/word/2023/wordml/word16du" xmlns:w16sdtdh="http://schemas.microsoft.com/office/word/2020/wordml/sdtdatahash" xmlns:w16sdtfl="http://schemas.microsoft.com/office/word/2024/wordml/sdtformatlock" xmlns:w16se="http://schemas.microsoft.com/office/word/2015/wordml/symex" xmlns:wpg="http://schemas.microsoft.com/office/word/2010/wordprocessingGroup" xmlns:wpi="http://schemas.microsoft.com/office/word/2010/wordprocessingInk" xmlns:wne="http://schemas.microsoft.com/office/word/2006/wordml" xmlns:wps="http://schemas.microsoft.com/office/word/2010/wordprocessingShape" mc:Ignorable="w14 w15 w16se w16cid w16 w16cex w16sdtdh w16sdtfl w16du wp14">
+<w:hdr xmlns:wpc="http://schemas.microsoft.com/office/word/2010/wordprocessingCanvas" xmlns:cx="http://schemas.microsoft.com/office/drawing/2014/chartex" xmlns:cx1="http://schemas.microsoft.com/office/drawing/2015/9/8/chartex" xmlns:cx2="http://schemas.microsoft.com/office/drawing/2015/10/21/chartex" xmlns:cx3="http://schemas.microsoft.com/office/drawing/2016/5/9/chartex" xmlns:cx4="http://schemas.microsoft.com/office/drawing/2016/5/10/chartex" xmlns:cx5="http://schemas.microsoft.com/office/drawing/2016/5/11/chartex" xmlns:cx6="http://schemas.microsoft.com/office/drawing/2016/5/12/chartex" xmlns:cx7="http://schemas.microsoft.com/office/drawing/2016/5/13/chartex" xmlns:cx8="http://schemas.microsoft.com/office/drawing/2016/5/14/chartex" xmlns:mc="http://schemas.openxmlformats.org/markup-compatibility/2006" xmlns:aink="http://schemas.microsoft.com/office/drawing/2016/ink" xmlns:am3d="http://schemas.microsoft.com/office/drawing/2017/model3d" xmlns:o="urn:schemas-microsoft-com:office:office" xmlns:r="http://schemas.openxmlformats.org/officeDocument/2006/relationships" xmlns:m="http://schemas.openxmlformats.org/officeDocument/2006/math" xmlns:v="urn:schemas-microsoft-com:vml" xmlns:wp14="http://schemas.microsoft.com/office/word/2010/wordprocessingDrawing" xmlns:wp="http://schemas.openxmlformats.org/drawingml/2006/wordprocessingDrawing" xmlns:w10="urn:schemas-microsoft-com:office:word" xmlns:w="http://schemas.openxmlformats.org/wordprocessingml/2006/main" xmlns:w14="http://schemas.microsoft.com/office/word/2010/wordml" xmlns:w15="http://schemas.microsoft.com/office/word/2012/wordml" xmlns:w16cex="http://schemas.microsoft.com/office/word/2018/wordml/cex" xmlns:w16cid="http://schemas.microsoft.com/office/word/2016/wordml/cid" xmlns:w16="http://schemas.microsoft.com/office/word/2018/wordml" xmlns:w16sdtdh="http://schemas.microsoft.com/office/word/2020/wordml/sdtdatahash" xmlns:w16se="http://schemas.microsoft.com/office/word/2015/wordml/symex" xmlns:wpg="http://schemas.microsoft.com/office/word/2010/wordprocessingGroup" xmlns:wpi="http://schemas.microsoft.com/office/word/2010/wordprocessingInk" xmlns:wne="http://schemas.microsoft.com/office/word/2006/wordml" xmlns:wps="http://schemas.microsoft.com/office/word/2010/wordprocessingShape" mc:Ignorable="w14 w15 w16se w16cid w16 w16cex w16sdtdh wp14">
   <w:p>
     <w:pPr>
-      <w:pStyle w:val="Header"/>
+      <w:pStyle w:val="Encabezado"/>
       <w:pBdr>
         <w:bottom w:val="single" w:sz="6" w:space="1" w:color="D9E2F3"/>
       </w:pBdr>
@@ -2251,7 +2397,7 @@
 </file>
 
 <file path=word/numbering.xml><?xml version="1.0" encoding="utf-8"?>
-<w:numbering xmlns:wpc="http://schemas.microsoft.com/office/word/2010/wordprocessingCanvas" xmlns:cx="http://schemas.microsoft.com/office/drawing/2014/chartex" xmlns:cx1="http://schemas.microsoft.com/office/drawing/2015/9/8/chartex" xmlns:cx2="http://schemas.microsoft.com/office/drawing/2015/10/21/chartex" xmlns:cx3="http://schemas.microsoft.com/office/drawing/2016/5/9/chartex" xmlns:cx4="http://schemas.microsoft.com/office/drawing/2016/5/10/chartex" xmlns:cx5="http://schemas.microsoft.com/office/drawing/2016/5/11/chartex" xmlns:cx6="http://schemas.microsoft.com/office/drawing/2016/5/12/chartex" xmlns:cx7="http://schemas.microsoft.com/office/drawing/2016/5/13/chartex" xmlns:cx8="http://schemas.microsoft.com/office/drawing/2016/5/14/chartex" xmlns:mc="http://schemas.openxmlformats.org/markup-compatibility/2006" xmlns:aink="http://schemas.microsoft.com/office/drawing/2016/ink" xmlns:am3d="http://schemas.microsoft.com/office/drawing/2017/model3d" xmlns:o="urn:schemas-microsoft-com:office:office" xmlns:oel="http://schemas.microsoft.com/office/2019/extlst" xmlns:r="http://schemas.openxmlformats.org/officeDocument/2006/relationships" xmlns:m="http://schemas.openxmlformats.org/officeDocument/2006/math" xmlns:v="urn:schemas-microsoft-com:vml" xmlns:wp14="http://schemas.microsoft.com/office/word/2010/wordprocessingDrawing" xmlns:wp="http://schemas.openxmlformats.org/drawingml/2006/wordprocessingDrawing" xmlns:w10="urn:schemas-microsoft-com:office:word" xmlns:w="http://schemas.openxmlformats.org/wordprocessingml/2006/main" xmlns:w14="http://schemas.microsoft.com/office/word/2010/wordml" xmlns:w15="http://schemas.microsoft.com/office/word/2012/wordml" xmlns:w16cei="http://schemas.microsoft.com/office/word/2026/wordml/cei" xmlns:w16cex="http://schemas.microsoft.com/office/word/2018/wordml/cex" xmlns:w16cid="http://schemas.microsoft.com/office/word/2016/wordml/cid" xmlns:w16="http://schemas.microsoft.com/office/word/2018/wordml" xmlns:w16du="http://schemas.microsoft.com/office/word/2023/wordml/word16du" xmlns:w16sdtdh="http://schemas.microsoft.com/office/word/2020/wordml/sdtdatahash" xmlns:w16sdtfl="http://schemas.microsoft.com/office/word/2024/wordml/sdtformatlock" xmlns:w16se="http://schemas.microsoft.com/office/word/2015/wordml/symex" xmlns:wpg="http://schemas.microsoft.com/office/word/2010/wordprocessingGroup" xmlns:wpi="http://schemas.microsoft.com/office/word/2010/wordprocessingInk" xmlns:wne="http://schemas.microsoft.com/office/word/2006/wordml" xmlns:wps="http://schemas.microsoft.com/office/word/2010/wordprocessingShape" mc:Ignorable="w14 w15 w16se w16cid w16 w16cex w16sdtdh w16sdtfl w16du wp14">
+<w:numbering xmlns:wpc="http://schemas.microsoft.com/office/word/2010/wordprocessingCanvas" xmlns:cx="http://schemas.microsoft.com/office/drawing/2014/chartex" xmlns:cx1="http://schemas.microsoft.com/office/drawing/2015/9/8/chartex" xmlns:cx2="http://schemas.microsoft.com/office/drawing/2015/10/21/chartex" xmlns:cx3="http://schemas.microsoft.com/office/drawing/2016/5/9/chartex" xmlns:cx4="http://schemas.microsoft.com/office/drawing/2016/5/10/chartex" xmlns:cx5="http://schemas.microsoft.com/office/drawing/2016/5/11/chartex" xmlns:cx6="http://schemas.microsoft.com/office/drawing/2016/5/12/chartex" xmlns:cx7="http://schemas.microsoft.com/office/drawing/2016/5/13/chartex" xmlns:cx8="http://schemas.microsoft.com/office/drawing/2016/5/14/chartex" xmlns:mc="http://schemas.openxmlformats.org/markup-compatibility/2006" xmlns:aink="http://schemas.microsoft.com/office/drawing/2016/ink" xmlns:am3d="http://schemas.microsoft.com/office/drawing/2017/model3d" xmlns:o="urn:schemas-microsoft-com:office:office" xmlns:r="http://schemas.openxmlformats.org/officeDocument/2006/relationships" xmlns:m="http://schemas.openxmlformats.org/officeDocument/2006/math" xmlns:v="urn:schemas-microsoft-com:vml" xmlns:wp14="http://schemas.microsoft.com/office/word/2010/wordprocessingDrawing" xmlns:wp="http://schemas.openxmlformats.org/drawingml/2006/wordprocessingDrawing" xmlns:w10="urn:schemas-microsoft-com:office:word" xmlns:w="http://schemas.openxmlformats.org/wordprocessingml/2006/main" xmlns:w14="http://schemas.microsoft.com/office/word/2010/wordml" xmlns:w15="http://schemas.microsoft.com/office/word/2012/wordml" xmlns:w16cex="http://schemas.microsoft.com/office/word/2018/wordml/cex" xmlns:w16cid="http://schemas.microsoft.com/office/word/2016/wordml/cid" xmlns:w16="http://schemas.microsoft.com/office/word/2018/wordml" xmlns:w16sdtdh="http://schemas.microsoft.com/office/word/2020/wordml/sdtdatahash" xmlns:w16se="http://schemas.microsoft.com/office/word/2015/wordml/symex" xmlns:wpg="http://schemas.microsoft.com/office/word/2010/wordprocessingGroup" xmlns:wpi="http://schemas.microsoft.com/office/word/2010/wordprocessingInk" xmlns:wne="http://schemas.microsoft.com/office/word/2006/wordml" xmlns:wps="http://schemas.microsoft.com/office/word/2010/wordprocessingShape" mc:Ignorable="w14 w15 w16se w16cid w16 w16cex w16sdtdh wp14">
   <w:abstractNum w:abstractNumId="0" w15:restartNumberingAfterBreak="0">
     <w:nsid w:val="FFFFFF7C"/>
     <w:multiLevelType w:val="singleLevel"/>
@@ -2293,7 +2439,7 @@
     <w:lvl w:ilvl="0">
       <w:start w:val="1"/>
       <w:numFmt w:val="decimal"/>
-      <w:pStyle w:val="ListNumber3"/>
+      <w:pStyle w:val="Listaconnmeros3"/>
       <w:lvlText w:val="%1."/>
       <w:lvlJc w:val="left"/>
       <w:pPr>
@@ -2311,7 +2457,7 @@
     <w:lvl w:ilvl="0">
       <w:start w:val="1"/>
       <w:numFmt w:val="decimal"/>
-      <w:pStyle w:val="ListNumber2"/>
+      <w:pStyle w:val="Listaconnmeros2"/>
       <w:lvlText w:val="%1."/>
       <w:lvlJc w:val="left"/>
       <w:pPr>
@@ -2349,7 +2495,7 @@
     <w:lvl w:ilvl="0">
       <w:start w:val="1"/>
       <w:numFmt w:val="bullet"/>
-      <w:pStyle w:val="ListBullet3"/>
+      <w:pStyle w:val="Listaconvietas3"/>
       <w:lvlText w:val=""/>
       <w:lvlJc w:val="left"/>
       <w:pPr>
@@ -2370,7 +2516,7 @@
     <w:lvl w:ilvl="0">
       <w:start w:val="1"/>
       <w:numFmt w:val="bullet"/>
-      <w:pStyle w:val="ListBullet2"/>
+      <w:pStyle w:val="Listaconvietas2"/>
       <w:lvlText w:val=""/>
       <w:lvlJc w:val="left"/>
       <w:pPr>
@@ -2391,7 +2537,7 @@
     <w:lvl w:ilvl="0">
       <w:start w:val="1"/>
       <w:numFmt w:val="decimal"/>
-      <w:pStyle w:val="ListNumber"/>
+      <w:pStyle w:val="Listaconnmeros"/>
       <w:lvlText w:val="%1."/>
       <w:lvlJc w:val="left"/>
       <w:pPr>
@@ -2409,7 +2555,7 @@
     <w:lvl w:ilvl="0">
       <w:start w:val="1"/>
       <w:numFmt w:val="bullet"/>
-      <w:pStyle w:val="ListBullet"/>
+      <w:pStyle w:val="Listaconvietas"/>
       <w:lvlText w:val=""/>
       <w:lvlJc w:val="left"/>
       <w:pPr>
@@ -2423,38 +2569,38 @@
       </w:rPr>
     </w:lvl>
   </w:abstractNum>
-  <w:num w:numId="1" w16cid:durableId="608588318">
+  <w:num w:numId="1">
     <w:abstractNumId w:val="8"/>
   </w:num>
-  <w:num w:numId="2" w16cid:durableId="1995795199">
+  <w:num w:numId="2">
     <w:abstractNumId w:val="6"/>
   </w:num>
-  <w:num w:numId="3" w16cid:durableId="147744456">
+  <w:num w:numId="3">
     <w:abstractNumId w:val="5"/>
   </w:num>
-  <w:num w:numId="4" w16cid:durableId="1833596054">
+  <w:num w:numId="4">
     <w:abstractNumId w:val="4"/>
   </w:num>
-  <w:num w:numId="5" w16cid:durableId="412821082">
+  <w:num w:numId="5">
     <w:abstractNumId w:val="7"/>
   </w:num>
-  <w:num w:numId="6" w16cid:durableId="885793502">
+  <w:num w:numId="6">
     <w:abstractNumId w:val="3"/>
   </w:num>
-  <w:num w:numId="7" w16cid:durableId="1663964994">
+  <w:num w:numId="7">
     <w:abstractNumId w:val="2"/>
   </w:num>
-  <w:num w:numId="8" w16cid:durableId="2079357711">
+  <w:num w:numId="8">
     <w:abstractNumId w:val="1"/>
   </w:num>
-  <w:num w:numId="9" w16cid:durableId="1187208165">
+  <w:num w:numId="9">
     <w:abstractNumId w:val="0"/>
   </w:num>
 </w:numbering>
 </file>
 
 <file path=word/styles.xml><?xml version="1.0" encoding="utf-8"?>
-<w:styles xmlns:mc="http://schemas.openxmlformats.org/markup-compatibility/2006" xmlns:r="http://schemas.openxmlformats.org/officeDocument/2006/relationships" xmlns:w="http://schemas.openxmlformats.org/wordprocessingml/2006/main" xmlns:w14="http://schemas.microsoft.com/office/word/2010/wordml" xmlns:w15="http://schemas.microsoft.com/office/word/2012/wordml" xmlns:w16cex="http://schemas.microsoft.com/office/word/2018/wordml/cex" xmlns:w16cid="http://schemas.microsoft.com/office/word/2016/wordml/cid" xmlns:w16="http://schemas.microsoft.com/office/word/2018/wordml" xmlns:w16du="http://schemas.microsoft.com/office/word/2023/wordml/word16du" xmlns:w16sdtdh="http://schemas.microsoft.com/office/word/2020/wordml/sdtdatahash" xmlns:w16sdtfl="http://schemas.microsoft.com/office/word/2024/wordml/sdtformatlock" xmlns:w16se="http://schemas.microsoft.com/office/word/2015/wordml/symex" mc:Ignorable="w14 w15 w16se w16cid w16 w16cex w16sdtdh w16sdtfl w16du">
+<w:styles xmlns:mc="http://schemas.openxmlformats.org/markup-compatibility/2006" xmlns:r="http://schemas.openxmlformats.org/officeDocument/2006/relationships" xmlns:w="http://schemas.openxmlformats.org/wordprocessingml/2006/main" xmlns:w14="http://schemas.microsoft.com/office/word/2010/wordml" xmlns:w15="http://schemas.microsoft.com/office/word/2012/wordml" xmlns:w16cex="http://schemas.microsoft.com/office/word/2018/wordml/cex" xmlns:w16cid="http://schemas.microsoft.com/office/word/2016/wordml/cid" xmlns:w16="http://schemas.microsoft.com/office/word/2018/wordml" xmlns:w16sdtdh="http://schemas.microsoft.com/office/word/2020/wordml/sdtdatahash" xmlns:w16se="http://schemas.microsoft.com/office/word/2015/wordml/symex" mc:Ignorable="w14 w15 w16se w16cid w16 w16cex w16sdtdh">
   <w:docDefaults>
     <w:rPrDefault>
       <w:rPr>
@@ -2852,11 +2998,11 @@
       <w:sz w:val="23"/>
     </w:rPr>
   </w:style>
-  <w:style w:type="paragraph" w:styleId="Heading1">
+  <w:style w:type="paragraph" w:styleId="Ttulo1">
     <w:name w:val="heading 1"/>
     <w:basedOn w:val="Normal"/>
     <w:next w:val="Normal"/>
-    <w:link w:val="Heading1Char"/>
+    <w:link w:val="Ttulo1Car"/>
     <w:uiPriority w:val="9"/>
     <w:qFormat/>
     <w:rsid w:val="00FC693F"/>
@@ -2875,11 +3021,11 @@
       <w:szCs w:val="28"/>
     </w:rPr>
   </w:style>
-  <w:style w:type="paragraph" w:styleId="Heading2">
+  <w:style w:type="paragraph" w:styleId="Ttulo2">
     <w:name w:val="heading 2"/>
     <w:basedOn w:val="Normal"/>
     <w:next w:val="Normal"/>
-    <w:link w:val="Heading2Char"/>
+    <w:link w:val="Ttulo2Car"/>
     <w:uiPriority w:val="9"/>
     <w:unhideWhenUsed/>
     <w:qFormat/>
@@ -2899,11 +3045,11 @@
       <w:szCs w:val="26"/>
     </w:rPr>
   </w:style>
-  <w:style w:type="paragraph" w:styleId="Heading3">
+  <w:style w:type="paragraph" w:styleId="Ttulo3">
     <w:name w:val="heading 3"/>
     <w:basedOn w:val="Normal"/>
     <w:next w:val="Normal"/>
-    <w:link w:val="Heading3Char"/>
+    <w:link w:val="Ttulo3Car"/>
     <w:uiPriority w:val="9"/>
     <w:unhideWhenUsed/>
     <w:qFormat/>
@@ -2921,11 +3067,11 @@
       <w:color w:val="4F81BD" w:themeColor="accent1"/>
     </w:rPr>
   </w:style>
-  <w:style w:type="paragraph" w:styleId="Heading4">
+  <w:style w:type="paragraph" w:styleId="Ttulo4">
     <w:name w:val="heading 4"/>
     <w:basedOn w:val="Normal"/>
     <w:next w:val="Normal"/>
-    <w:link w:val="Heading4Char"/>
+    <w:link w:val="Ttulo4Car"/>
     <w:uiPriority w:val="9"/>
     <w:semiHidden/>
     <w:unhideWhenUsed/>
@@ -2946,11 +3092,11 @@
       <w:color w:val="4F81BD" w:themeColor="accent1"/>
     </w:rPr>
   </w:style>
-  <w:style w:type="paragraph" w:styleId="Heading5">
+  <w:style w:type="paragraph" w:styleId="Ttulo5">
     <w:name w:val="heading 5"/>
     <w:basedOn w:val="Normal"/>
     <w:next w:val="Normal"/>
-    <w:link w:val="Heading5Char"/>
+    <w:link w:val="Ttulo5Car"/>
     <w:uiPriority w:val="9"/>
     <w:semiHidden/>
     <w:unhideWhenUsed/>
@@ -2967,11 +3113,11 @@
       <w:color w:val="243F60" w:themeColor="accent1" w:themeShade="7F"/>
     </w:rPr>
   </w:style>
-  <w:style w:type="paragraph" w:styleId="Heading6">
+  <w:style w:type="paragraph" w:styleId="Ttulo6">
     <w:name w:val="heading 6"/>
     <w:basedOn w:val="Normal"/>
     <w:next w:val="Normal"/>
-    <w:link w:val="Heading6Char"/>
+    <w:link w:val="Ttulo6Car"/>
     <w:uiPriority w:val="9"/>
     <w:semiHidden/>
     <w:unhideWhenUsed/>
@@ -2990,11 +3136,11 @@
       <w:color w:val="243F60" w:themeColor="accent1" w:themeShade="7F"/>
     </w:rPr>
   </w:style>
-  <w:style w:type="paragraph" w:styleId="Heading7">
+  <w:style w:type="paragraph" w:styleId="Ttulo7">
     <w:name w:val="heading 7"/>
     <w:basedOn w:val="Normal"/>
     <w:next w:val="Normal"/>
-    <w:link w:val="Heading7Char"/>
+    <w:link w:val="Ttulo7Car"/>
     <w:uiPriority w:val="9"/>
     <w:semiHidden/>
     <w:unhideWhenUsed/>
@@ -3013,11 +3159,11 @@
       <w:color w:val="404040" w:themeColor="text1" w:themeTint="BF"/>
     </w:rPr>
   </w:style>
-  <w:style w:type="paragraph" w:styleId="Heading8">
+  <w:style w:type="paragraph" w:styleId="Ttulo8">
     <w:name w:val="heading 8"/>
     <w:basedOn w:val="Normal"/>
     <w:next w:val="Normal"/>
-    <w:link w:val="Heading8Char"/>
+    <w:link w:val="Ttulo8Car"/>
     <w:uiPriority w:val="9"/>
     <w:semiHidden/>
     <w:unhideWhenUsed/>
@@ -3036,11 +3182,11 @@
       <w:szCs w:val="20"/>
     </w:rPr>
   </w:style>
-  <w:style w:type="paragraph" w:styleId="Heading9">
+  <w:style w:type="paragraph" w:styleId="Ttulo9">
     <w:name w:val="heading 9"/>
     <w:basedOn w:val="Normal"/>
     <w:next w:val="Normal"/>
-    <w:link w:val="Heading9Char"/>
+    <w:link w:val="Ttulo9Car"/>
     <w:uiPriority w:val="9"/>
     <w:semiHidden/>
     <w:unhideWhenUsed/>
@@ -3061,13 +3207,13 @@
       <w:szCs w:val="20"/>
     </w:rPr>
   </w:style>
-  <w:style w:type="character" w:default="1" w:styleId="DefaultParagraphFont">
+  <w:style w:type="character" w:default="1" w:styleId="Fuentedeprrafopredeter">
     <w:name w:val="Default Paragraph Font"/>
     <w:uiPriority w:val="1"/>
     <w:semiHidden/>
     <w:unhideWhenUsed/>
   </w:style>
-  <w:style w:type="table" w:default="1" w:styleId="TableNormal">
+  <w:style w:type="table" w:default="1" w:styleId="Tablanormal">
     <w:name w:val="Normal Table"/>
     <w:uiPriority w:val="99"/>
     <w:semiHidden/>
@@ -3082,16 +3228,16 @@
       </w:tblCellMar>
     </w:tblPr>
   </w:style>
-  <w:style w:type="numbering" w:default="1" w:styleId="NoList">
+  <w:style w:type="numbering" w:default="1" w:styleId="Sinlista">
     <w:name w:val="No List"/>
     <w:uiPriority w:val="99"/>
     <w:semiHidden/>
     <w:unhideWhenUsed/>
   </w:style>
-  <w:style w:type="paragraph" w:styleId="Header">
+  <w:style w:type="paragraph" w:styleId="Encabezado">
     <w:name w:val="header"/>
     <w:basedOn w:val="Normal"/>
-    <w:link w:val="HeaderChar"/>
+    <w:link w:val="EncabezadoCar"/>
     <w:uiPriority w:val="99"/>
     <w:unhideWhenUsed/>
     <w:rsid w:val="00E618BF"/>
@@ -3103,17 +3249,17 @@
       <w:spacing w:after="0" w:line="240" w:lineRule="auto"/>
     </w:pPr>
   </w:style>
-  <w:style w:type="character" w:customStyle="1" w:styleId="HeaderChar">
-    <w:name w:val="Header Char"/>
-    <w:basedOn w:val="DefaultParagraphFont"/>
-    <w:link w:val="Header"/>
+  <w:style w:type="character" w:customStyle="1" w:styleId="EncabezadoCar">
+    <w:name w:val="Encabezado Car"/>
+    <w:basedOn w:val="Fuentedeprrafopredeter"/>
+    <w:link w:val="Encabezado"/>
     <w:uiPriority w:val="99"/>
     <w:rsid w:val="00E618BF"/>
   </w:style>
-  <w:style w:type="paragraph" w:styleId="Footer">
+  <w:style w:type="paragraph" w:styleId="Piedepgina">
     <w:name w:val="footer"/>
     <w:basedOn w:val="Normal"/>
-    <w:link w:val="FooterChar"/>
+    <w:link w:val="PiedepginaCar"/>
     <w:uiPriority w:val="99"/>
     <w:unhideWhenUsed/>
     <w:rsid w:val="00E618BF"/>
@@ -3125,14 +3271,14 @@
       <w:spacing w:after="0" w:line="240" w:lineRule="auto"/>
     </w:pPr>
   </w:style>
-  <w:style w:type="character" w:customStyle="1" w:styleId="FooterChar">
-    <w:name w:val="Footer Char"/>
-    <w:basedOn w:val="DefaultParagraphFont"/>
-    <w:link w:val="Footer"/>
+  <w:style w:type="character" w:customStyle="1" w:styleId="PiedepginaCar">
+    <w:name w:val="Pie de página Car"/>
+    <w:basedOn w:val="Fuentedeprrafopredeter"/>
+    <w:link w:val="Piedepgina"/>
     <w:uiPriority w:val="99"/>
     <w:rsid w:val="00E618BF"/>
   </w:style>
-  <w:style w:type="paragraph" w:styleId="NoSpacing">
+  <w:style w:type="paragraph" w:styleId="Sinespaciado">
     <w:name w:val="No Spacing"/>
     <w:uiPriority w:val="1"/>
     <w:qFormat/>
@@ -3141,10 +3287,10 @@
       <w:spacing w:after="0" w:line="240" w:lineRule="auto"/>
     </w:pPr>
   </w:style>
-  <w:style w:type="character" w:customStyle="1" w:styleId="Heading1Char">
-    <w:name w:val="Heading 1 Char"/>
-    <w:basedOn w:val="DefaultParagraphFont"/>
-    <w:link w:val="Heading1"/>
+  <w:style w:type="character" w:customStyle="1" w:styleId="Ttulo1Car">
+    <w:name w:val="Título 1 Car"/>
+    <w:basedOn w:val="Fuentedeprrafopredeter"/>
+    <w:link w:val="Ttulo1"/>
     <w:uiPriority w:val="9"/>
     <w:rsid w:val="00FC693F"/>
     <w:rPr>
@@ -3156,10 +3302,10 @@
       <w:szCs w:val="28"/>
     </w:rPr>
   </w:style>
-  <w:style w:type="character" w:customStyle="1" w:styleId="Heading2Char">
-    <w:name w:val="Heading 2 Char"/>
-    <w:basedOn w:val="DefaultParagraphFont"/>
-    <w:link w:val="Heading2"/>
+  <w:style w:type="character" w:customStyle="1" w:styleId="Ttulo2Car">
+    <w:name w:val="Título 2 Car"/>
+    <w:basedOn w:val="Fuentedeprrafopredeter"/>
+    <w:link w:val="Ttulo2"/>
     <w:uiPriority w:val="9"/>
     <w:rsid w:val="00FC693F"/>
     <w:rPr>
@@ -3171,10 +3317,10 @@
       <w:szCs w:val="26"/>
     </w:rPr>
   </w:style>
-  <w:style w:type="character" w:customStyle="1" w:styleId="Heading3Char">
-    <w:name w:val="Heading 3 Char"/>
-    <w:basedOn w:val="DefaultParagraphFont"/>
-    <w:link w:val="Heading3"/>
+  <w:style w:type="character" w:customStyle="1" w:styleId="Ttulo3Car">
+    <w:name w:val="Título 3 Car"/>
+    <w:basedOn w:val="Fuentedeprrafopredeter"/>
+    <w:link w:val="Ttulo3"/>
     <w:uiPriority w:val="9"/>
     <w:rsid w:val="00FC693F"/>
     <w:rPr>
@@ -3184,11 +3330,11 @@
       <w:color w:val="4F81BD" w:themeColor="accent1"/>
     </w:rPr>
   </w:style>
-  <w:style w:type="paragraph" w:styleId="Title">
+  <w:style w:type="paragraph" w:styleId="Ttulo">
     <w:name w:val="Title"/>
     <w:basedOn w:val="Normal"/>
     <w:next w:val="Normal"/>
-    <w:link w:val="TitleChar"/>
+    <w:link w:val="TtuloCar"/>
     <w:uiPriority w:val="10"/>
     <w:qFormat/>
     <w:rsid w:val="00FC693F"/>
@@ -3209,10 +3355,10 @@
       <w:szCs w:val="52"/>
     </w:rPr>
   </w:style>
-  <w:style w:type="character" w:customStyle="1" w:styleId="TitleChar">
-    <w:name w:val="Title Char"/>
-    <w:basedOn w:val="DefaultParagraphFont"/>
-    <w:link w:val="Title"/>
+  <w:style w:type="character" w:customStyle="1" w:styleId="TtuloCar">
+    <w:name w:val="Título Car"/>
+    <w:basedOn w:val="Fuentedeprrafopredeter"/>
+    <w:link w:val="Ttulo"/>
     <w:uiPriority w:val="10"/>
     <w:rsid w:val="00FC693F"/>
     <w:rPr>
@@ -3224,11 +3370,11 @@
       <w:szCs w:val="52"/>
     </w:rPr>
   </w:style>
-  <w:style w:type="paragraph" w:styleId="Subtitle">
+  <w:style w:type="paragraph" w:styleId="Subttulo">
     <w:name w:val="Subtitle"/>
     <w:basedOn w:val="Normal"/>
     <w:next w:val="Normal"/>
-    <w:link w:val="SubtitleChar"/>
+    <w:link w:val="SubttuloCar"/>
     <w:uiPriority w:val="11"/>
     <w:qFormat/>
     <w:rsid w:val="00FC693F"/>
@@ -3247,10 +3393,10 @@
       <w:szCs w:val="24"/>
     </w:rPr>
   </w:style>
-  <w:style w:type="character" w:customStyle="1" w:styleId="SubtitleChar">
-    <w:name w:val="Subtitle Char"/>
-    <w:basedOn w:val="DefaultParagraphFont"/>
-    <w:link w:val="Subtitle"/>
+  <w:style w:type="character" w:customStyle="1" w:styleId="SubttuloCar">
+    <w:name w:val="Subtítulo Car"/>
+    <w:basedOn w:val="Fuentedeprrafopredeter"/>
+    <w:link w:val="Subttulo"/>
     <w:uiPriority w:val="11"/>
     <w:rsid w:val="00FC693F"/>
     <w:rPr>
@@ -3263,7 +3409,7 @@
       <w:szCs w:val="24"/>
     </w:rPr>
   </w:style>
-  <w:style w:type="paragraph" w:styleId="ListParagraph">
+  <w:style w:type="paragraph" w:styleId="Prrafodelista">
     <w:name w:val="List Paragraph"/>
     <w:basedOn w:val="Normal"/>
     <w:uiPriority w:val="34"/>
@@ -3274,25 +3420,25 @@
       <w:contextualSpacing/>
     </w:pPr>
   </w:style>
-  <w:style w:type="paragraph" w:styleId="BodyText">
+  <w:style w:type="paragraph" w:styleId="Textoindependiente">
     <w:name w:val="Body Text"/>
     <w:basedOn w:val="Normal"/>
-    <w:link w:val="BodyTextChar"/>
+    <w:link w:val="TextoindependienteCar"/>
     <w:uiPriority w:val="99"/>
     <w:unhideWhenUsed/>
     <w:rsid w:val="00AA1D8D"/>
   </w:style>
-  <w:style w:type="character" w:customStyle="1" w:styleId="BodyTextChar">
-    <w:name w:val="Body Text Char"/>
-    <w:basedOn w:val="DefaultParagraphFont"/>
-    <w:link w:val="BodyText"/>
+  <w:style w:type="character" w:customStyle="1" w:styleId="TextoindependienteCar">
+    <w:name w:val="Texto independiente Car"/>
+    <w:basedOn w:val="Fuentedeprrafopredeter"/>
+    <w:link w:val="Textoindependiente"/>
     <w:uiPriority w:val="99"/>
     <w:rsid w:val="00AA1D8D"/>
   </w:style>
-  <w:style w:type="paragraph" w:styleId="BodyText2">
+  <w:style w:type="paragraph" w:styleId="Textoindependiente2">
     <w:name w:val="Body Text 2"/>
     <w:basedOn w:val="Normal"/>
-    <w:link w:val="BodyText2Char"/>
+    <w:link w:val="Textoindependiente2Car"/>
     <w:uiPriority w:val="99"/>
     <w:unhideWhenUsed/>
     <w:rsid w:val="00AA1D8D"/>
@@ -3300,17 +3446,17 @@
       <w:spacing w:line="480" w:lineRule="auto"/>
     </w:pPr>
   </w:style>
-  <w:style w:type="character" w:customStyle="1" w:styleId="BodyText2Char">
-    <w:name w:val="Body Text 2 Char"/>
-    <w:basedOn w:val="DefaultParagraphFont"/>
-    <w:link w:val="BodyText2"/>
+  <w:style w:type="character" w:customStyle="1" w:styleId="Textoindependiente2Car">
+    <w:name w:val="Texto independiente 2 Car"/>
+    <w:basedOn w:val="Fuentedeprrafopredeter"/>
+    <w:link w:val="Textoindependiente2"/>
     <w:uiPriority w:val="99"/>
     <w:rsid w:val="00AA1D8D"/>
   </w:style>
-  <w:style w:type="paragraph" w:styleId="BodyText3">
+  <w:style w:type="paragraph" w:styleId="Textoindependiente3">
     <w:name w:val="Body Text 3"/>
     <w:basedOn w:val="Normal"/>
-    <w:link w:val="BodyText3Char"/>
+    <w:link w:val="Textoindependiente3Car"/>
     <w:uiPriority w:val="99"/>
     <w:unhideWhenUsed/>
     <w:rsid w:val="00AA1D8D"/>
@@ -3319,10 +3465,10 @@
       <w:szCs w:val="16"/>
     </w:rPr>
   </w:style>
-  <w:style w:type="character" w:customStyle="1" w:styleId="BodyText3Char">
-    <w:name w:val="Body Text 3 Char"/>
-    <w:basedOn w:val="DefaultParagraphFont"/>
-    <w:link w:val="BodyText3"/>
+  <w:style w:type="character" w:customStyle="1" w:styleId="Textoindependiente3Car">
+    <w:name w:val="Texto independiente 3 Car"/>
+    <w:basedOn w:val="Fuentedeprrafopredeter"/>
+    <w:link w:val="Textoindependiente3"/>
     <w:uiPriority w:val="99"/>
     <w:rsid w:val="00AA1D8D"/>
     <w:rPr>
@@ -3330,7 +3476,7 @@
       <w:szCs w:val="16"/>
     </w:rPr>
   </w:style>
-  <w:style w:type="paragraph" w:styleId="List">
+  <w:style w:type="paragraph" w:styleId="Lista">
     <w:name w:val="List"/>
     <w:basedOn w:val="Normal"/>
     <w:uiPriority w:val="99"/>
@@ -3341,7 +3487,7 @@
       <w:contextualSpacing/>
     </w:pPr>
   </w:style>
-  <w:style w:type="paragraph" w:styleId="List2">
+  <w:style w:type="paragraph" w:styleId="Lista2">
     <w:name w:val="List 2"/>
     <w:basedOn w:val="Normal"/>
     <w:uiPriority w:val="99"/>
@@ -3352,7 +3498,7 @@
       <w:contextualSpacing/>
     </w:pPr>
   </w:style>
-  <w:style w:type="paragraph" w:styleId="List3">
+  <w:style w:type="paragraph" w:styleId="Lista3">
     <w:name w:val="List 3"/>
     <w:basedOn w:val="Normal"/>
     <w:uiPriority w:val="99"/>
@@ -3363,7 +3509,7 @@
       <w:contextualSpacing/>
     </w:pPr>
   </w:style>
-  <w:style w:type="paragraph" w:styleId="ListBullet">
+  <w:style w:type="paragraph" w:styleId="Listaconvietas">
     <w:name w:val="List Bullet"/>
     <w:basedOn w:val="Normal"/>
     <w:uiPriority w:val="99"/>
@@ -3376,7 +3522,7 @@
       <w:contextualSpacing/>
     </w:pPr>
   </w:style>
-  <w:style w:type="paragraph" w:styleId="ListBullet2">
+  <w:style w:type="paragraph" w:styleId="Listaconvietas2">
     <w:name w:val="List Bullet 2"/>
     <w:basedOn w:val="Normal"/>
     <w:uiPriority w:val="99"/>
@@ -3389,7 +3535,7 @@
       <w:contextualSpacing/>
     </w:pPr>
   </w:style>
-  <w:style w:type="paragraph" w:styleId="ListBullet3">
+  <w:style w:type="paragraph" w:styleId="Listaconvietas3">
     <w:name w:val="List Bullet 3"/>
     <w:basedOn w:val="Normal"/>
     <w:uiPriority w:val="99"/>
@@ -3402,7 +3548,7 @@
       <w:contextualSpacing/>
     </w:pPr>
   </w:style>
-  <w:style w:type="paragraph" w:styleId="ListNumber">
+  <w:style w:type="paragraph" w:styleId="Listaconnmeros">
     <w:name w:val="List Number"/>
     <w:basedOn w:val="Normal"/>
     <w:uiPriority w:val="99"/>
@@ -3415,7 +3561,7 @@
       <w:contextualSpacing/>
     </w:pPr>
   </w:style>
-  <w:style w:type="paragraph" w:styleId="ListNumber2">
+  <w:style w:type="paragraph" w:styleId="Listaconnmeros2">
     <w:name w:val="List Number 2"/>
     <w:basedOn w:val="Normal"/>
     <w:uiPriority w:val="99"/>
@@ -3428,7 +3574,7 @@
       <w:contextualSpacing/>
     </w:pPr>
   </w:style>
-  <w:style w:type="paragraph" w:styleId="ListNumber3">
+  <w:style w:type="paragraph" w:styleId="Listaconnmeros3">
     <w:name w:val="List Number 3"/>
     <w:basedOn w:val="Normal"/>
     <w:uiPriority w:val="99"/>
@@ -3441,7 +3587,7 @@
       <w:contextualSpacing/>
     </w:pPr>
   </w:style>
-  <w:style w:type="paragraph" w:styleId="ListContinue">
+  <w:style w:type="paragraph" w:styleId="Continuarlista">
     <w:name w:val="List Continue"/>
     <w:basedOn w:val="Normal"/>
     <w:uiPriority w:val="99"/>
@@ -3452,7 +3598,7 @@
       <w:contextualSpacing/>
     </w:pPr>
   </w:style>
-  <w:style w:type="paragraph" w:styleId="ListContinue2">
+  <w:style w:type="paragraph" w:styleId="Continuarlista2">
     <w:name w:val="List Continue 2"/>
     <w:basedOn w:val="Normal"/>
     <w:uiPriority w:val="99"/>
@@ -3463,7 +3609,7 @@
       <w:contextualSpacing/>
     </w:pPr>
   </w:style>
-  <w:style w:type="paragraph" w:styleId="ListContinue3">
+  <w:style w:type="paragraph" w:styleId="Continuarlista3">
     <w:name w:val="List Continue 3"/>
     <w:basedOn w:val="Normal"/>
     <w:uiPriority w:val="99"/>
@@ -3474,9 +3620,9 @@
       <w:contextualSpacing/>
     </w:pPr>
   </w:style>
-  <w:style w:type="paragraph" w:styleId="MacroText">
+  <w:style w:type="paragraph" w:styleId="Textomacro">
     <w:name w:val="macro"/>
-    <w:link w:val="MacroTextChar"/>
+    <w:link w:val="TextomacroCar"/>
     <w:uiPriority w:val="99"/>
     <w:unhideWhenUsed/>
     <w:rsid w:val="0029639D"/>
@@ -3497,10 +3643,10 @@
       <w:szCs w:val="20"/>
     </w:rPr>
   </w:style>
-  <w:style w:type="character" w:customStyle="1" w:styleId="MacroTextChar">
-    <w:name w:val="Macro Text Char"/>
-    <w:basedOn w:val="DefaultParagraphFont"/>
-    <w:link w:val="MacroText"/>
+  <w:style w:type="character" w:customStyle="1" w:styleId="TextomacroCar">
+    <w:name w:val="Texto macro Car"/>
+    <w:basedOn w:val="Fuentedeprrafopredeter"/>
+    <w:link w:val="Textomacro"/>
     <w:uiPriority w:val="99"/>
     <w:rsid w:val="0029639D"/>
     <w:rPr>
@@ -3509,11 +3655,11 @@
       <w:szCs w:val="20"/>
     </w:rPr>
   </w:style>
-  <w:style w:type="paragraph" w:styleId="Quote">
+  <w:style w:type="paragraph" w:styleId="Cita">
     <w:name w:val="Quote"/>
     <w:basedOn w:val="Normal"/>
     <w:next w:val="Normal"/>
-    <w:link w:val="QuoteChar"/>
+    <w:link w:val="CitaCar"/>
     <w:uiPriority w:val="29"/>
     <w:qFormat/>
     <w:rsid w:val="00FC693F"/>
@@ -3523,10 +3669,10 @@
       <w:color w:val="000000" w:themeColor="text1"/>
     </w:rPr>
   </w:style>
-  <w:style w:type="character" w:customStyle="1" w:styleId="QuoteChar">
-    <w:name w:val="Quote Char"/>
-    <w:basedOn w:val="DefaultParagraphFont"/>
-    <w:link w:val="Quote"/>
+  <w:style w:type="character" w:customStyle="1" w:styleId="CitaCar">
+    <w:name w:val="Cita Car"/>
+    <w:basedOn w:val="Fuentedeprrafopredeter"/>
+    <w:link w:val="Cita"/>
     <w:uiPriority w:val="29"/>
     <w:rsid w:val="00FC693F"/>
     <w:rPr>
@@ -3535,10 +3681,10 @@
       <w:color w:val="000000" w:themeColor="text1"/>
     </w:rPr>
   </w:style>
-  <w:style w:type="character" w:customStyle="1" w:styleId="Heading4Char">
-    <w:name w:val="Heading 4 Char"/>
-    <w:basedOn w:val="DefaultParagraphFont"/>
-    <w:link w:val="Heading4"/>
+  <w:style w:type="character" w:customStyle="1" w:styleId="Ttulo4Car">
+    <w:name w:val="Título 4 Car"/>
+    <w:basedOn w:val="Fuentedeprrafopredeter"/>
+    <w:link w:val="Ttulo4"/>
     <w:uiPriority w:val="9"/>
     <w:semiHidden/>
     <w:rsid w:val="00FC693F"/>
@@ -3551,10 +3697,10 @@
       <w:color w:val="4F81BD" w:themeColor="accent1"/>
     </w:rPr>
   </w:style>
-  <w:style w:type="character" w:customStyle="1" w:styleId="Heading5Char">
-    <w:name w:val="Heading 5 Char"/>
-    <w:basedOn w:val="DefaultParagraphFont"/>
-    <w:link w:val="Heading5"/>
+  <w:style w:type="character" w:customStyle="1" w:styleId="Ttulo5Car">
+    <w:name w:val="Título 5 Car"/>
+    <w:basedOn w:val="Fuentedeprrafopredeter"/>
+    <w:link w:val="Ttulo5"/>
     <w:uiPriority w:val="9"/>
     <w:semiHidden/>
     <w:rsid w:val="00FC693F"/>
@@ -3563,10 +3709,10 @@
       <w:color w:val="243F60" w:themeColor="accent1" w:themeShade="7F"/>
     </w:rPr>
   </w:style>
-  <w:style w:type="character" w:customStyle="1" w:styleId="Heading6Char">
-    <w:name w:val="Heading 6 Char"/>
-    <w:basedOn w:val="DefaultParagraphFont"/>
-    <w:link w:val="Heading6"/>
+  <w:style w:type="character" w:customStyle="1" w:styleId="Ttulo6Car">
+    <w:name w:val="Título 6 Car"/>
+    <w:basedOn w:val="Fuentedeprrafopredeter"/>
+    <w:link w:val="Ttulo6"/>
     <w:uiPriority w:val="9"/>
     <w:semiHidden/>
     <w:rsid w:val="00FC693F"/>
@@ -3577,10 +3723,10 @@
       <w:color w:val="243F60" w:themeColor="accent1" w:themeShade="7F"/>
     </w:rPr>
   </w:style>
-  <w:style w:type="character" w:customStyle="1" w:styleId="Heading7Char">
-    <w:name w:val="Heading 7 Char"/>
-    <w:basedOn w:val="DefaultParagraphFont"/>
-    <w:link w:val="Heading7"/>
+  <w:style w:type="character" w:customStyle="1" w:styleId="Ttulo7Car">
+    <w:name w:val="Título 7 Car"/>
+    <w:basedOn w:val="Fuentedeprrafopredeter"/>
+    <w:link w:val="Ttulo7"/>
     <w:uiPriority w:val="9"/>
     <w:semiHidden/>
     <w:rsid w:val="00FC693F"/>
@@ -3591,10 +3737,10 @@
       <w:color w:val="404040" w:themeColor="text1" w:themeTint="BF"/>
     </w:rPr>
   </w:style>
-  <w:style w:type="character" w:customStyle="1" w:styleId="Heading8Char">
-    <w:name w:val="Heading 8 Char"/>
-    <w:basedOn w:val="DefaultParagraphFont"/>
-    <w:link w:val="Heading8"/>
+  <w:style w:type="character" w:customStyle="1" w:styleId="Ttulo8Car">
+    <w:name w:val="Título 8 Car"/>
+    <w:basedOn w:val="Fuentedeprrafopredeter"/>
+    <w:link w:val="Ttulo8"/>
     <w:uiPriority w:val="9"/>
     <w:semiHidden/>
     <w:rsid w:val="00FC693F"/>
@@ -3605,10 +3751,10 @@
       <w:szCs w:val="20"/>
     </w:rPr>
   </w:style>
-  <w:style w:type="character" w:customStyle="1" w:styleId="Heading9Char">
-    <w:name w:val="Heading 9 Char"/>
-    <w:basedOn w:val="DefaultParagraphFont"/>
-    <w:link w:val="Heading9"/>
+  <w:style w:type="character" w:customStyle="1" w:styleId="Ttulo9Car">
+    <w:name w:val="Título 9 Car"/>
+    <w:basedOn w:val="Fuentedeprrafopredeter"/>
+    <w:link w:val="Ttulo9"/>
     <w:uiPriority w:val="9"/>
     <w:semiHidden/>
     <w:rsid w:val="00FC693F"/>
@@ -3621,7 +3767,7 @@
       <w:szCs w:val="20"/>
     </w:rPr>
   </w:style>
-  <w:style w:type="paragraph" w:styleId="Caption">
+  <w:style w:type="paragraph" w:styleId="Descripcin">
     <w:name w:val="caption"/>
     <w:basedOn w:val="Normal"/>
     <w:next w:val="Normal"/>
@@ -3641,9 +3787,9 @@
       <w:szCs w:val="18"/>
     </w:rPr>
   </w:style>
-  <w:style w:type="character" w:styleId="Strong">
+  <w:style w:type="character" w:styleId="Textoennegrita">
     <w:name w:val="Strong"/>
-    <w:basedOn w:val="DefaultParagraphFont"/>
+    <w:basedOn w:val="Fuentedeprrafopredeter"/>
     <w:uiPriority w:val="22"/>
     <w:qFormat/>
     <w:rsid w:val="00FC693F"/>
@@ -3652,9 +3798,9 @@
       <w:bCs/>
     </w:rPr>
   </w:style>
-  <w:style w:type="character" w:styleId="Emphasis">
+  <w:style w:type="character" w:styleId="nfasis">
     <w:name w:val="Emphasis"/>
-    <w:basedOn w:val="DefaultParagraphFont"/>
+    <w:basedOn w:val="Fuentedeprrafopredeter"/>
     <w:uiPriority w:val="20"/>
     <w:qFormat/>
     <w:rsid w:val="00FC693F"/>
@@ -3663,11 +3809,11 @@
       <w:iCs/>
     </w:rPr>
   </w:style>
-  <w:style w:type="paragraph" w:styleId="IntenseQuote">
+  <w:style w:type="paragraph" w:styleId="Citadestacada">
     <w:name w:val="Intense Quote"/>
     <w:basedOn w:val="Normal"/>
     <w:next w:val="Normal"/>
-    <w:link w:val="IntenseQuoteChar"/>
+    <w:link w:val="CitadestacadaCar"/>
     <w:uiPriority w:val="30"/>
     <w:qFormat/>
     <w:rsid w:val="00FC693F"/>
@@ -3686,10 +3832,10 @@
       <w:color w:val="4F81BD" w:themeColor="accent1"/>
     </w:rPr>
   </w:style>
-  <w:style w:type="character" w:customStyle="1" w:styleId="IntenseQuoteChar">
-    <w:name w:val="Intense Quote Char"/>
-    <w:basedOn w:val="DefaultParagraphFont"/>
-    <w:link w:val="IntenseQuote"/>
+  <w:style w:type="character" w:customStyle="1" w:styleId="CitadestacadaCar">
+    <w:name w:val="Cita destacada Car"/>
+    <w:basedOn w:val="Fuentedeprrafopredeter"/>
+    <w:link w:val="Citadestacada"/>
     <w:uiPriority w:val="30"/>
     <w:rsid w:val="00FC693F"/>
     <w:rPr>
@@ -3700,9 +3846,9 @@
       <w:color w:val="4F81BD" w:themeColor="accent1"/>
     </w:rPr>
   </w:style>
-  <w:style w:type="character" w:styleId="SubtleEmphasis">
+  <w:style w:type="character" w:styleId="nfasissutil">
     <w:name w:val="Subtle Emphasis"/>
-    <w:basedOn w:val="DefaultParagraphFont"/>
+    <w:basedOn w:val="Fuentedeprrafopredeter"/>
     <w:uiPriority w:val="19"/>
     <w:qFormat/>
     <w:rsid w:val="00FC693F"/>
@@ -3712,9 +3858,9 @@
       <w:color w:val="808080" w:themeColor="text1" w:themeTint="7F"/>
     </w:rPr>
   </w:style>
-  <w:style w:type="character" w:styleId="IntenseEmphasis">
+  <w:style w:type="character" w:styleId="nfasisintenso">
     <w:name w:val="Intense Emphasis"/>
-    <w:basedOn w:val="DefaultParagraphFont"/>
+    <w:basedOn w:val="Fuentedeprrafopredeter"/>
     <w:uiPriority w:val="21"/>
     <w:qFormat/>
     <w:rsid w:val="00FC693F"/>
@@ -3726,9 +3872,9 @@
       <w:color w:val="4F81BD" w:themeColor="accent1"/>
     </w:rPr>
   </w:style>
-  <w:style w:type="character" w:styleId="SubtleReference">
+  <w:style w:type="character" w:styleId="Referenciasutil">
     <w:name w:val="Subtle Reference"/>
-    <w:basedOn w:val="DefaultParagraphFont"/>
+    <w:basedOn w:val="Fuentedeprrafopredeter"/>
     <w:uiPriority w:val="31"/>
     <w:qFormat/>
     <w:rsid w:val="00FC693F"/>
@@ -3738,9 +3884,9 @@
       <w:u w:val="single"/>
     </w:rPr>
   </w:style>
-  <w:style w:type="character" w:styleId="IntenseReference">
+  <w:style w:type="character" w:styleId="Referenciaintensa">
     <w:name w:val="Intense Reference"/>
-    <w:basedOn w:val="DefaultParagraphFont"/>
+    <w:basedOn w:val="Fuentedeprrafopredeter"/>
     <w:uiPriority w:val="32"/>
     <w:qFormat/>
     <w:rsid w:val="00FC693F"/>
@@ -3753,9 +3899,9 @@
       <w:u w:val="single"/>
     </w:rPr>
   </w:style>
-  <w:style w:type="character" w:styleId="BookTitle">
+  <w:style w:type="character" w:styleId="Ttulodellibro">
     <w:name w:val="Book Title"/>
-    <w:basedOn w:val="DefaultParagraphFont"/>
+    <w:basedOn w:val="Fuentedeprrafopredeter"/>
     <w:uiPriority w:val="33"/>
     <w:qFormat/>
     <w:rsid w:val="00FC693F"/>
@@ -3766,9 +3912,9 @@
       <w:spacing w:val="5"/>
     </w:rPr>
   </w:style>
-  <w:style w:type="paragraph" w:styleId="TOCHeading">
+  <w:style w:type="paragraph" w:styleId="TtuloTDC">
     <w:name w:val="TOC Heading"/>
-    <w:basedOn w:val="Heading1"/>
+    <w:basedOn w:val="Ttulo1"/>
     <w:next w:val="Normal"/>
     <w:uiPriority w:val="39"/>
     <w:semiHidden/>
@@ -3779,9 +3925,9 @@
       <w:outlineLvl w:val="9"/>
     </w:pPr>
   </w:style>
-  <w:style w:type="table" w:styleId="TableGrid">
+  <w:style w:type="table" w:styleId="Tablaconcuadrcula">
     <w:name w:val="Table Grid"/>
-    <w:basedOn w:val="TableNormal"/>
+    <w:basedOn w:val="Tablanormal"/>
     <w:uiPriority w:val="59"/>
     <w:rsid w:val="00FC693F"/>
     <w:pPr>
@@ -3798,9 +3944,9 @@
       </w:tblBorders>
     </w:tblPr>
   </w:style>
-  <w:style w:type="table" w:styleId="LightShading">
+  <w:style w:type="table" w:styleId="Sombreadoclaro">
     <w:name w:val="Light Shading"/>
-    <w:basedOn w:val="TableNormal"/>
+    <w:basedOn w:val="Tablanormal"/>
     <w:uiPriority w:val="60"/>
     <w:rsid w:val="00FC693F"/>
     <w:pPr>
@@ -3894,9 +4040,9 @@
       </w:tcPr>
     </w:tblStylePr>
   </w:style>
-  <w:style w:type="table" w:styleId="LightShading-Accent1">
+  <w:style w:type="table" w:styleId="Sombreadoclaro-nfasis1">
     <w:name w:val="Light Shading Accent 1"/>
-    <w:basedOn w:val="TableNormal"/>
+    <w:basedOn w:val="Tablanormal"/>
     <w:uiPriority w:val="60"/>
     <w:rsid w:val="00FC693F"/>
     <w:pPr>
@@ -3990,9 +4136,9 @@
       </w:tcPr>
     </w:tblStylePr>
   </w:style>
-  <w:style w:type="table" w:styleId="LightShading-Accent2">
+  <w:style w:type="table" w:styleId="Sombreadoclaro-nfasis2">
     <w:name w:val="Light Shading Accent 2"/>
-    <w:basedOn w:val="TableNormal"/>
+    <w:basedOn w:val="Tablanormal"/>
     <w:uiPriority w:val="60"/>
     <w:rsid w:val="00FC693F"/>
     <w:pPr>
@@ -4086,9 +4232,9 @@
       </w:tcPr>
     </w:tblStylePr>
   </w:style>
-  <w:style w:type="table" w:styleId="LightShading-Accent3">
+  <w:style w:type="table" w:styleId="Sombreadoclaro-nfasis3">
     <w:name w:val="Light Shading Accent 3"/>
-    <w:basedOn w:val="TableNormal"/>
+    <w:basedOn w:val="Tablanormal"/>
     <w:uiPriority w:val="60"/>
     <w:rsid w:val="00FC693F"/>
     <w:pPr>
@@ -4182,9 +4328,9 @@
       </w:tcPr>
     </w:tblStylePr>
   </w:style>
-  <w:style w:type="table" w:styleId="LightShading-Accent4">
+  <w:style w:type="table" w:styleId="Sombreadoclaro-nfasis4">
     <w:name w:val="Light Shading Accent 4"/>
-    <w:basedOn w:val="TableNormal"/>
+    <w:basedOn w:val="Tablanormal"/>
     <w:uiPriority w:val="60"/>
     <w:rsid w:val="00FC693F"/>
     <w:pPr>
@@ -4278,9 +4424,9 @@
       </w:tcPr>
     </w:tblStylePr>
   </w:style>
-  <w:style w:type="table" w:styleId="LightShading-Accent5">
+  <w:style w:type="table" w:styleId="Sombreadoclaro-nfasis5">
     <w:name w:val="Light Shading Accent 5"/>
-    <w:basedOn w:val="TableNormal"/>
+    <w:basedOn w:val="Tablanormal"/>
     <w:uiPriority w:val="60"/>
     <w:rsid w:val="00FC693F"/>
     <w:pPr>
@@ -4374,9 +4520,9 @@
       </w:tcPr>
     </w:tblStylePr>
   </w:style>
-  <w:style w:type="table" w:styleId="LightShading-Accent6">
+  <w:style w:type="table" w:styleId="Sombreadoclaro-nfasis6">
     <w:name w:val="Light Shading Accent 6"/>
-    <w:basedOn w:val="TableNormal"/>
+    <w:basedOn w:val="Tablanormal"/>
     <w:uiPriority w:val="60"/>
     <w:rsid w:val="00FC693F"/>
     <w:pPr>
@@ -4470,9 +4616,9 @@
       </w:tcPr>
     </w:tblStylePr>
   </w:style>
-  <w:style w:type="table" w:styleId="LightList">
+  <w:style w:type="table" w:styleId="Listaclara">
     <w:name w:val="Light List"/>
-    <w:basedOn w:val="TableNormal"/>
+    <w:basedOn w:val="Tablanormal"/>
     <w:uiPriority w:val="61"/>
     <w:rsid w:val="00FC693F"/>
     <w:pPr>
@@ -4555,9 +4701,9 @@
       </w:tcPr>
     </w:tblStylePr>
   </w:style>
-  <w:style w:type="table" w:styleId="LightList-Accent1">
+  <w:style w:type="table" w:styleId="Listaclara-nfasis1">
     <w:name w:val="Light List Accent 1"/>
-    <w:basedOn w:val="TableNormal"/>
+    <w:basedOn w:val="Tablanormal"/>
     <w:uiPriority w:val="61"/>
     <w:rsid w:val="00FC693F"/>
     <w:pPr>
@@ -4640,9 +4786,9 @@
       </w:tcPr>
     </w:tblStylePr>
   </w:style>
-  <w:style w:type="table" w:styleId="LightList-Accent2">
+  <w:style w:type="table" w:styleId="Listaclara-nfasis2">
     <w:name w:val="Light List Accent 2"/>
-    <w:basedOn w:val="TableNormal"/>
+    <w:basedOn w:val="Tablanormal"/>
     <w:uiPriority w:val="61"/>
     <w:rsid w:val="00CB0664"/>
     <w:pPr>
@@ -4725,9 +4871,9 @@
       </w:tcPr>
     </w:tblStylePr>
   </w:style>
-  <w:style w:type="table" w:styleId="LightList-Accent3">
+  <w:style w:type="table" w:styleId="Listaclara-nfasis3">
     <w:name w:val="Light List Accent 3"/>
-    <w:basedOn w:val="TableNormal"/>
+    <w:basedOn w:val="Tablanormal"/>
     <w:uiPriority w:val="61"/>
     <w:rsid w:val="00CB0664"/>
     <w:pPr>
@@ -4810,9 +4956,9 @@
       </w:tcPr>
     </w:tblStylePr>
   </w:style>
-  <w:style w:type="table" w:styleId="LightList-Accent4">
+  <w:style w:type="table" w:styleId="Listaclara-nfasis4">
     <w:name w:val="Light List Accent 4"/>
-    <w:basedOn w:val="TableNormal"/>
+    <w:basedOn w:val="Tablanormal"/>
     <w:uiPriority w:val="61"/>
     <w:rsid w:val="00CB0664"/>
     <w:pPr>
@@ -4895,9 +5041,9 @@
       </w:tcPr>
     </w:tblStylePr>
   </w:style>
-  <w:style w:type="table" w:styleId="LightList-Accent5">
+  <w:style w:type="table" w:styleId="Listaclara-nfasis5">
     <w:name w:val="Light List Accent 5"/>
-    <w:basedOn w:val="TableNormal"/>
+    <w:basedOn w:val="Tablanormal"/>
     <w:uiPriority w:val="61"/>
     <w:rsid w:val="00CB0664"/>
     <w:pPr>
@@ -4980,9 +5126,9 @@
       </w:tcPr>
     </w:tblStylePr>
   </w:style>
-  <w:style w:type="table" w:styleId="LightList-Accent6">
+  <w:style w:type="table" w:styleId="Listaclara-nfasis6">
     <w:name w:val="Light List Accent 6"/>
-    <w:basedOn w:val="TableNormal"/>
+    <w:basedOn w:val="Tablanormal"/>
     <w:uiPriority w:val="61"/>
     <w:rsid w:val="00CB0664"/>
     <w:pPr>
@@ -5065,9 +5211,9 @@
       </w:tcPr>
     </w:tblStylePr>
   </w:style>
-  <w:style w:type="table" w:styleId="LightGrid">
+  <w:style w:type="table" w:styleId="Cuadrculaclara">
     <w:name w:val="Light Grid"/>
-    <w:basedOn w:val="TableNormal"/>
+    <w:basedOn w:val="Tablanormal"/>
     <w:uiPriority w:val="62"/>
     <w:rsid w:val="00CB0664"/>
     <w:pPr>
@@ -5188,9 +5334,9 @@
       </w:tcPr>
     </w:tblStylePr>
   </w:style>
-  <w:style w:type="table" w:styleId="LightGrid-Accent1">
+  <w:style w:type="table" w:styleId="Cuadrculaclara-nfasis1">
     <w:name w:val="Light Grid Accent 1"/>
-    <w:basedOn w:val="TableNormal"/>
+    <w:basedOn w:val="Tablanormal"/>
     <w:uiPriority w:val="62"/>
     <w:rsid w:val="00CB0664"/>
     <w:pPr>
@@ -5311,9 +5457,9 @@
       </w:tcPr>
     </w:tblStylePr>
   </w:style>
-  <w:style w:type="table" w:styleId="LightGrid-Accent2">
+  <w:style w:type="table" w:styleId="Cuadrculaclara-nfasis2">
     <w:name w:val="Light Grid Accent 2"/>
-    <w:basedOn w:val="TableNormal"/>
+    <w:basedOn w:val="Tablanormal"/>
     <w:uiPriority w:val="62"/>
     <w:rsid w:val="00CB0664"/>
     <w:pPr>
@@ -5434,9 +5580,9 @@
       </w:tcPr>
     </w:tblStylePr>
   </w:style>
-  <w:style w:type="table" w:styleId="LightGrid-Accent3">
+  <w:style w:type="table" w:styleId="Cuadrculaclara-nfasis3">
     <w:name w:val="Light Grid Accent 3"/>
-    <w:basedOn w:val="TableNormal"/>
+    <w:basedOn w:val="Tablanormal"/>
     <w:uiPriority w:val="62"/>
     <w:rsid w:val="00CB0664"/>
     <w:pPr>
@@ -5557,9 +5703,9 @@
       </w:tcPr>
     </w:tblStylePr>
   </w:style>
-  <w:style w:type="table" w:styleId="LightGrid-Accent4">
+  <w:style w:type="table" w:styleId="Cuadrculaclara-nfasis4">
     <w:name w:val="Light Grid Accent 4"/>
-    <w:basedOn w:val="TableNormal"/>
+    <w:basedOn w:val="Tablanormal"/>
     <w:uiPriority w:val="62"/>
     <w:rsid w:val="00CB0664"/>
     <w:pPr>
@@ -5680,9 +5826,9 @@
       </w:tcPr>
     </w:tblStylePr>
   </w:style>
-  <w:style w:type="table" w:styleId="LightGrid-Accent5">
+  <w:style w:type="table" w:styleId="Cuadrculaclara-nfasis5">
     <w:name w:val="Light Grid Accent 5"/>
-    <w:basedOn w:val="TableNormal"/>
+    <w:basedOn w:val="Tablanormal"/>
     <w:uiPriority w:val="62"/>
     <w:rsid w:val="00CB0664"/>
     <w:pPr>
@@ -5803,9 +5949,9 @@
       </w:tcPr>
     </w:tblStylePr>
   </w:style>
-  <w:style w:type="table" w:styleId="LightGrid-Accent6">
+  <w:style w:type="table" w:styleId="Cuadrculaclara-nfasis6">
     <w:name w:val="Light Grid Accent 6"/>
-    <w:basedOn w:val="TableNormal"/>
+    <w:basedOn w:val="Tablanormal"/>
     <w:uiPriority w:val="62"/>
     <w:rsid w:val="00CB0664"/>
     <w:pPr>
@@ -5926,9 +6072,9 @@
       </w:tcPr>
     </w:tblStylePr>
   </w:style>
-  <w:style w:type="table" w:styleId="MediumShading1">
+  <w:style w:type="table" w:styleId="Sombreadomedio1">
     <w:name w:val="Medium Shading 1"/>
-    <w:basedOn w:val="TableNormal"/>
+    <w:basedOn w:val="Tablanormal"/>
     <w:uiPriority w:val="63"/>
     <w:rsid w:val="00CB0664"/>
     <w:pPr>
@@ -6025,9 +6171,9 @@
       </w:tcPr>
     </w:tblStylePr>
   </w:style>
-  <w:style w:type="table" w:styleId="MediumShading1-Accent1">
+  <w:style w:type="table" w:styleId="Sombreadomedio1-nfasis1">
     <w:name w:val="Medium Shading 1 Accent 1"/>
-    <w:basedOn w:val="TableNormal"/>
+    <w:basedOn w:val="Tablanormal"/>
     <w:uiPriority w:val="63"/>
     <w:rsid w:val="00CB0664"/>
     <w:pPr>
@@ -6124,9 +6270,9 @@
       </w:tcPr>
     </w:tblStylePr>
   </w:style>
-  <w:style w:type="table" w:styleId="MediumShading1-Accent2">
+  <w:style w:type="table" w:styleId="Sombreadomedio1-nfasis2">
     <w:name w:val="Medium Shading 1 Accent 2"/>
-    <w:basedOn w:val="TableNormal"/>
+    <w:basedOn w:val="Tablanormal"/>
     <w:uiPriority w:val="63"/>
     <w:rsid w:val="00CB0664"/>
     <w:pPr>
@@ -6223,9 +6369,9 @@
       </w:tcPr>
     </w:tblStylePr>
   </w:style>
-  <w:style w:type="table" w:styleId="MediumShading1-Accent3">
+  <w:style w:type="table" w:styleId="Sombreadomedio1-nfasis3">
     <w:name w:val="Medium Shading 1 Accent 3"/>
-    <w:basedOn w:val="TableNormal"/>
+    <w:basedOn w:val="Tablanormal"/>
     <w:uiPriority w:val="63"/>
     <w:rsid w:val="00CB0664"/>
     <w:pPr>
@@ -6322,9 +6468,9 @@
       </w:tcPr>
     </w:tblStylePr>
   </w:style>
-  <w:style w:type="table" w:styleId="MediumShading1-Accent4">
+  <w:style w:type="table" w:styleId="Sombreadomedio1-nfasis4">
     <w:name w:val="Medium Shading 1 Accent 4"/>
-    <w:basedOn w:val="TableNormal"/>
+    <w:basedOn w:val="Tablanormal"/>
     <w:uiPriority w:val="63"/>
     <w:rsid w:val="00CB0664"/>
     <w:pPr>
@@ -6421,9 +6567,9 @@
       </w:tcPr>
     </w:tblStylePr>
   </w:style>
-  <w:style w:type="table" w:styleId="MediumShading1-Accent5">
+  <w:style w:type="table" w:styleId="Sombreadomedio1-nfasis5">
     <w:name w:val="Medium Shading 1 Accent 5"/>
-    <w:basedOn w:val="TableNormal"/>
+    <w:basedOn w:val="Tablanormal"/>
     <w:uiPriority w:val="63"/>
     <w:rsid w:val="00CB0664"/>
     <w:pPr>
@@ -6520,9 +6666,9 @@
       </w:tcPr>
     </w:tblStylePr>
   </w:style>
-  <w:style w:type="table" w:styleId="MediumShading1-Accent6">
+  <w:style w:type="table" w:styleId="Sombreadomedio1-nfasis6">
     <w:name w:val="Medium Shading 1 Accent 6"/>
-    <w:basedOn w:val="TableNormal"/>
+    <w:basedOn w:val="Tablanormal"/>
     <w:uiPriority w:val="63"/>
     <w:rsid w:val="00CB0664"/>
     <w:pPr>
@@ -6619,9 +6765,9 @@
       </w:tcPr>
     </w:tblStylePr>
   </w:style>
-  <w:style w:type="table" w:styleId="MediumShading2">
+  <w:style w:type="table" w:styleId="Sombreadomedio2">
     <w:name w:val="Medium Shading 2"/>
-    <w:basedOn w:val="TableNormal"/>
+    <w:basedOn w:val="Tablanormal"/>
     <w:uiPriority w:val="64"/>
     <w:rsid w:val="00CB0664"/>
     <w:pPr>
@@ -6761,9 +6907,9 @@
       </w:tcPr>
     </w:tblStylePr>
   </w:style>
-  <w:style w:type="table" w:styleId="MediumShading2-Accent1">
+  <w:style w:type="table" w:styleId="Sombreadomedio2-nfasis1">
     <w:name w:val="Medium Shading 2 Accent 1"/>
-    <w:basedOn w:val="TableNormal"/>
+    <w:basedOn w:val="Tablanormal"/>
     <w:uiPriority w:val="64"/>
     <w:rsid w:val="00CB0664"/>
     <w:pPr>
@@ -6903,9 +7049,9 @@
       </w:tcPr>
     </w:tblStylePr>
   </w:style>
-  <w:style w:type="table" w:styleId="MediumShading2-Accent2">
+  <w:style w:type="table" w:styleId="Sombreadomedio2-nfasis2">
     <w:name w:val="Medium Shading 2 Accent 2"/>
-    <w:basedOn w:val="TableNormal"/>
+    <w:basedOn w:val="Tablanormal"/>
     <w:uiPriority w:val="64"/>
     <w:rsid w:val="00CB0664"/>
     <w:pPr>
@@ -7045,9 +7191,9 @@
       </w:tcPr>
     </w:tblStylePr>
   </w:style>
-  <w:style w:type="table" w:styleId="MediumShading2-Accent3">
+  <w:style w:type="table" w:styleId="Sombreadomedio2-nfasis3">
     <w:name w:val="Medium Shading 2 Accent 3"/>
-    <w:basedOn w:val="TableNormal"/>
+    <w:basedOn w:val="Tablanormal"/>
     <w:uiPriority w:val="64"/>
     <w:rsid w:val="00CB0664"/>
     <w:pPr>
@@ -7187,9 +7333,9 @@
       </w:tcPr>
     </w:tblStylePr>
   </w:style>
-  <w:style w:type="table" w:styleId="MediumShading2-Accent4">
+  <w:style w:type="table" w:styleId="Sombreadomedio2-nfasis4">
     <w:name w:val="Medium Shading 2 Accent 4"/>
-    <w:basedOn w:val="TableNormal"/>
+    <w:basedOn w:val="Tablanormal"/>
     <w:uiPriority w:val="64"/>
     <w:rsid w:val="00CB0664"/>
     <w:pPr>
@@ -7329,9 +7475,9 @@
       </w:tcPr>
     </w:tblStylePr>
   </w:style>
-  <w:style w:type="table" w:styleId="MediumShading2-Accent5">
+  <w:style w:type="table" w:styleId="Sombreadomedio2-nfasis5">
     <w:name w:val="Medium Shading 2 Accent 5"/>
-    <w:basedOn w:val="TableNormal"/>
+    <w:basedOn w:val="Tablanormal"/>
     <w:uiPriority w:val="64"/>
     <w:rsid w:val="00CB0664"/>
     <w:pPr>
@@ -7471,9 +7617,9 @@
       </w:tcPr>
     </w:tblStylePr>
   </w:style>
-  <w:style w:type="table" w:styleId="MediumShading2-Accent6">
+  <w:style w:type="table" w:styleId="Sombreadomedio2-nfasis6">
     <w:name w:val="Medium Shading 2 Accent 6"/>
-    <w:basedOn w:val="TableNormal"/>
+    <w:basedOn w:val="Tablanormal"/>
     <w:uiPriority w:val="64"/>
     <w:rsid w:val="00CB0664"/>
     <w:pPr>
@@ -7613,9 +7759,9 @@
       </w:tcPr>
     </w:tblStylePr>
   </w:style>
-  <w:style w:type="table" w:styleId="MediumList1">
+  <w:style w:type="table" w:styleId="Listamedia1">
     <w:name w:val="Medium List 1"/>
-    <w:basedOn w:val="TableNormal"/>
+    <w:basedOn w:val="Tablanormal"/>
     <w:uiPriority w:val="65"/>
     <w:rsid w:val="00CB0664"/>
     <w:pPr>
@@ -7690,9 +7836,9 @@
       </w:tcPr>
     </w:tblStylePr>
   </w:style>
-  <w:style w:type="table" w:styleId="MediumList1-Accent1">
+  <w:style w:type="table" w:styleId="Listamedia1-nfasis1">
     <w:name w:val="Medium List 1 Accent 1"/>
-    <w:basedOn w:val="TableNormal"/>
+    <w:basedOn w:val="Tablanormal"/>
     <w:uiPriority w:val="65"/>
     <w:rsid w:val="00CB0664"/>
     <w:pPr>
@@ -7767,9 +7913,9 @@
       </w:tcPr>
     </w:tblStylePr>
   </w:style>
-  <w:style w:type="table" w:styleId="MediumList1-Accent2">
+  <w:style w:type="table" w:styleId="Listamedia1-nfasis2">
     <w:name w:val="Medium List 1 Accent 2"/>
-    <w:basedOn w:val="TableNormal"/>
+    <w:basedOn w:val="Tablanormal"/>
     <w:uiPriority w:val="65"/>
     <w:rsid w:val="00CB0664"/>
     <w:pPr>
@@ -7844,9 +7990,9 @@
       </w:tcPr>
     </w:tblStylePr>
   </w:style>
-  <w:style w:type="table" w:styleId="MediumList1-Accent3">
+  <w:style w:type="table" w:styleId="Listamedia1-nfasis3">
     <w:name w:val="Medium List 1 Accent 3"/>
-    <w:basedOn w:val="TableNormal"/>
+    <w:basedOn w:val="Tablanormal"/>
     <w:uiPriority w:val="65"/>
     <w:rsid w:val="00CB0664"/>
     <w:pPr>
@@ -7921,9 +8067,9 @@
       </w:tcPr>
     </w:tblStylePr>
   </w:style>
-  <w:style w:type="table" w:styleId="MediumList1-Accent4">
+  <w:style w:type="table" w:styleId="Listamedia1-nfasis4">
     <w:name w:val="Medium List 1 Accent 4"/>
-    <w:basedOn w:val="TableNormal"/>
+    <w:basedOn w:val="Tablanormal"/>
     <w:uiPriority w:val="65"/>
     <w:rsid w:val="00CB0664"/>
     <w:pPr>
@@ -7998,9 +8144,9 @@
       </w:tcPr>
     </w:tblStylePr>
   </w:style>
-  <w:style w:type="table" w:styleId="MediumList1-Accent5">
+  <w:style w:type="table" w:styleId="Listamedia1-nfasis5">
     <w:name w:val="Medium List 1 Accent 5"/>
-    <w:basedOn w:val="TableNormal"/>
+    <w:basedOn w:val="Tablanormal"/>
     <w:uiPriority w:val="65"/>
     <w:rsid w:val="00CB0664"/>
     <w:pPr>
@@ -8075,9 +8221,9 @@
       </w:tcPr>
     </w:tblStylePr>
   </w:style>
-  <w:style w:type="table" w:styleId="MediumList1-Accent6">
+  <w:style w:type="table" w:styleId="Listamedia1-nfasis6">
     <w:name w:val="Medium List 1 Accent 6"/>
-    <w:basedOn w:val="TableNormal"/>
+    <w:basedOn w:val="Tablanormal"/>
     <w:uiPriority w:val="65"/>
     <w:rsid w:val="00CB0664"/>
     <w:pPr>
@@ -8152,9 +8298,9 @@
       </w:tcPr>
     </w:tblStylePr>
   </w:style>
-  <w:style w:type="table" w:styleId="MediumList2">
+  <w:style w:type="table" w:styleId="Listamedia2">
     <w:name w:val="Medium List 2"/>
-    <w:basedOn w:val="TableNormal"/>
+    <w:basedOn w:val="Tablanormal"/>
     <w:uiPriority w:val="66"/>
     <w:rsid w:val="00CB0664"/>
     <w:pPr>
@@ -8273,9 +8419,9 @@
       </w:tcPr>
     </w:tblStylePr>
   </w:style>
-  <w:style w:type="table" w:styleId="MediumList2-Accent1">
+  <w:style w:type="table" w:styleId="Listamedia2-nfasis1">
     <w:name w:val="Medium List 2 Accent 1"/>
-    <w:basedOn w:val="TableNormal"/>
+    <w:basedOn w:val="Tablanormal"/>
     <w:uiPriority w:val="66"/>
     <w:rsid w:val="00CB0664"/>
     <w:pPr>
@@ -8394,9 +8540,9 @@
       </w:tcPr>
     </w:tblStylePr>
   </w:style>
-  <w:style w:type="table" w:styleId="MediumList2-Accent2">
+  <w:style w:type="table" w:styleId="Listamedia2-nfasis2">
     <w:name w:val="Medium List 2 Accent 2"/>
-    <w:basedOn w:val="TableNormal"/>
+    <w:basedOn w:val="Tablanormal"/>
     <w:uiPriority w:val="66"/>
     <w:rsid w:val="00CB0664"/>
     <w:pPr>
@@ -8515,9 +8661,9 @@
       </w:tcPr>
     </w:tblStylePr>
   </w:style>
-  <w:style w:type="table" w:styleId="MediumList2-Accent3">
+  <w:style w:type="table" w:styleId="Listamedia2-nfasis3">
     <w:name w:val="Medium List 2 Accent 3"/>
-    <w:basedOn w:val="TableNormal"/>
+    <w:basedOn w:val="Tablanormal"/>
     <w:uiPriority w:val="66"/>
     <w:rsid w:val="00CB0664"/>
     <w:pPr>
@@ -8636,9 +8782,9 @@
       </w:tcPr>
     </w:tblStylePr>
   </w:style>
-  <w:style w:type="table" w:styleId="MediumList2-Accent4">
+  <w:style w:type="table" w:styleId="Listamedia2-nfasis4">
     <w:name w:val="Medium List 2 Accent 4"/>
-    <w:basedOn w:val="TableNormal"/>
+    <w:basedOn w:val="Tablanormal"/>
     <w:uiPriority w:val="66"/>
     <w:rsid w:val="00CB0664"/>
     <w:pPr>
@@ -8757,9 +8903,9 @@
       </w:tcPr>
     </w:tblStylePr>
   </w:style>
-  <w:style w:type="table" w:styleId="MediumList2-Accent5">
+  <w:style w:type="table" w:styleId="Listamedia2-nfasis5">
     <w:name w:val="Medium List 2 Accent 5"/>
-    <w:basedOn w:val="TableNormal"/>
+    <w:basedOn w:val="Tablanormal"/>
     <w:uiPriority w:val="66"/>
     <w:rsid w:val="00CB0664"/>
     <w:pPr>
@@ -8878,9 +9024,9 @@
       </w:tcPr>
     </w:tblStylePr>
   </w:style>
-  <w:style w:type="table" w:styleId="MediumList2-Accent6">
+  <w:style w:type="table" w:styleId="Listamedia2-nfasis6">
     <w:name w:val="Medium List 2 Accent 6"/>
-    <w:basedOn w:val="TableNormal"/>
+    <w:basedOn w:val="Tablanormal"/>
     <w:uiPriority w:val="66"/>
     <w:rsid w:val="00CB0664"/>
     <w:pPr>
@@ -8999,9 +9145,9 @@
       </w:tcPr>
     </w:tblStylePr>
   </w:style>
-  <w:style w:type="table" w:styleId="MediumGrid1">
+  <w:style w:type="table" w:styleId="Cuadrculamedia1">
     <w:name w:val="Medium Grid 1"/>
-    <w:basedOn w:val="TableNormal"/>
+    <w:basedOn w:val="Tablanormal"/>
     <w:uiPriority w:val="67"/>
     <w:rsid w:val="00CB0664"/>
     <w:pPr>
@@ -9065,9 +9211,9 @@
       </w:tcPr>
     </w:tblStylePr>
   </w:style>
-  <w:style w:type="table" w:styleId="MediumGrid1-Accent1">
+  <w:style w:type="table" w:styleId="Cuadrculamedia1-nfasis1">
     <w:name w:val="Medium Grid 1 Accent 1"/>
-    <w:basedOn w:val="TableNormal"/>
+    <w:basedOn w:val="Tablanormal"/>
     <w:uiPriority w:val="67"/>
     <w:rsid w:val="00CB0664"/>
     <w:pPr>
@@ -9131,9 +9277,9 @@
       </w:tcPr>
     </w:tblStylePr>
   </w:style>
-  <w:style w:type="table" w:styleId="MediumGrid1-Accent2">
+  <w:style w:type="table" w:styleId="Cuadrculamedia1-nfasis2">
     <w:name w:val="Medium Grid 1 Accent 2"/>
-    <w:basedOn w:val="TableNormal"/>
+    <w:basedOn w:val="Tablanormal"/>
     <w:uiPriority w:val="67"/>
     <w:rsid w:val="00CB0664"/>
     <w:pPr>
@@ -9197,9 +9343,9 @@
       </w:tcPr>
     </w:tblStylePr>
   </w:style>
-  <w:style w:type="table" w:styleId="MediumGrid1-Accent3">
+  <w:style w:type="table" w:styleId="Cuadrculamedia1-nfasis3">
     <w:name w:val="Medium Grid 1 Accent 3"/>
-    <w:basedOn w:val="TableNormal"/>
+    <w:basedOn w:val="Tablanormal"/>
     <w:uiPriority w:val="67"/>
     <w:rsid w:val="00CB0664"/>
     <w:pPr>
@@ -9263,9 +9409,9 @@
       </w:tcPr>
     </w:tblStylePr>
   </w:style>
-  <w:style w:type="table" w:styleId="MediumGrid1-Accent4">
+  <w:style w:type="table" w:styleId="Cuadrculamedia1-nfasis4">
     <w:name w:val="Medium Grid 1 Accent 4"/>
-    <w:basedOn w:val="TableNormal"/>
+    <w:basedOn w:val="Tablanormal"/>
     <w:uiPriority w:val="67"/>
     <w:rsid w:val="00CB0664"/>
     <w:pPr>
@@ -9329,9 +9475,9 @@
       </w:tcPr>
     </w:tblStylePr>
   </w:style>
-  <w:style w:type="table" w:styleId="MediumGrid1-Accent5">
+  <w:style w:type="table" w:styleId="Cuadrculamedia1-nfasis5">
     <w:name w:val="Medium Grid 1 Accent 5"/>
-    <w:basedOn w:val="TableNormal"/>
+    <w:basedOn w:val="Tablanormal"/>
     <w:uiPriority w:val="67"/>
     <w:rsid w:val="00CB0664"/>
     <w:pPr>
@@ -9395,9 +9541,9 @@
       </w:tcPr>
     </w:tblStylePr>
   </w:style>
-  <w:style w:type="table" w:styleId="MediumGrid1-Accent6">
+  <w:style w:type="table" w:styleId="Cuadrculamedia1-nfasis6">
     <w:name w:val="Medium Grid 1 Accent 6"/>
-    <w:basedOn w:val="TableNormal"/>
+    <w:basedOn w:val="Tablanormal"/>
     <w:uiPriority w:val="67"/>
     <w:rsid w:val="00CB0664"/>
     <w:pPr>
@@ -9461,9 +9607,9 @@
       </w:tcPr>
     </w:tblStylePr>
   </w:style>
-  <w:style w:type="table" w:styleId="MediumGrid2">
+  <w:style w:type="table" w:styleId="Cuadrculamedia2">
     <w:name w:val="Medium Grid 2"/>
-    <w:basedOn w:val="TableNormal"/>
+    <w:basedOn w:val="Tablanormal"/>
     <w:uiPriority w:val="68"/>
     <w:rsid w:val="00CB0664"/>
     <w:pPr>
@@ -9579,9 +9725,9 @@
       </w:tcPr>
     </w:tblStylePr>
   </w:style>
-  <w:style w:type="table" w:styleId="MediumGrid2-Accent1">
+  <w:style w:type="table" w:styleId="Cuadrculamedia2-nfasis1">
     <w:name w:val="Medium Grid 2 Accent 1"/>
-    <w:basedOn w:val="TableNormal"/>
+    <w:basedOn w:val="Tablanormal"/>
     <w:uiPriority w:val="68"/>
     <w:rsid w:val="00CB0664"/>
     <w:pPr>
@@ -9697,9 +9843,9 @@
       </w:tcPr>
     </w:tblStylePr>
   </w:style>
-  <w:style w:type="table" w:styleId="MediumGrid2-Accent2">
+  <w:style w:type="table" w:styleId="Cuadrculamedia2-nfasis2">
     <w:name w:val="Medium Grid 2 Accent 2"/>
-    <w:basedOn w:val="TableNormal"/>
+    <w:basedOn w:val="Tablanormal"/>
     <w:uiPriority w:val="68"/>
     <w:rsid w:val="00CB0664"/>
     <w:pPr>
@@ -9815,9 +9961,9 @@
       </w:tcPr>
     </w:tblStylePr>
   </w:style>
-  <w:style w:type="table" w:styleId="MediumGrid2-Accent3">
+  <w:style w:type="table" w:styleId="Cuadrculamedia2-nfasis3">
     <w:name w:val="Medium Grid 2 Accent 3"/>
-    <w:basedOn w:val="TableNormal"/>
+    <w:basedOn w:val="Tablanormal"/>
     <w:uiPriority w:val="68"/>
     <w:rsid w:val="00CB0664"/>
     <w:pPr>
@@ -9933,9 +10079,9 @@
       </w:tcPr>
     </w:tblStylePr>
   </w:style>
-  <w:style w:type="table" w:styleId="MediumGrid2-Accent4">
+  <w:style w:type="table" w:styleId="Cuadrculamedia2-nfasis4">
     <w:name w:val="Medium Grid 2 Accent 4"/>
-    <w:basedOn w:val="TableNormal"/>
+    <w:basedOn w:val="Tablanormal"/>
     <w:uiPriority w:val="68"/>
     <w:rsid w:val="00CB0664"/>
     <w:pPr>
@@ -10051,9 +10197,9 @@
       </w:tcPr>
     </w:tblStylePr>
   </w:style>
-  <w:style w:type="table" w:styleId="MediumGrid2-Accent5">
+  <w:style w:type="table" w:styleId="Cuadrculamedia2-nfasis5">
     <w:name w:val="Medium Grid 2 Accent 5"/>
-    <w:basedOn w:val="TableNormal"/>
+    <w:basedOn w:val="Tablanormal"/>
     <w:uiPriority w:val="68"/>
     <w:rsid w:val="00CB0664"/>
     <w:pPr>
@@ -10169,9 +10315,9 @@
       </w:tcPr>
     </w:tblStylePr>
   </w:style>
-  <w:style w:type="table" w:styleId="MediumGrid2-Accent6">
+  <w:style w:type="table" w:styleId="Cuadrculamedia2-nfasis6">
     <w:name w:val="Medium Grid 2 Accent 6"/>
-    <w:basedOn w:val="TableNormal"/>
+    <w:basedOn w:val="Tablanormal"/>
     <w:uiPriority w:val="68"/>
     <w:rsid w:val="00CB0664"/>
     <w:pPr>
@@ -10287,9 +10433,9 @@
       </w:tcPr>
     </w:tblStylePr>
   </w:style>
-  <w:style w:type="table" w:styleId="MediumGrid3">
+  <w:style w:type="table" w:styleId="Cuadrculamedia3">
     <w:name w:val="Medium Grid 3"/>
-    <w:basedOn w:val="TableNormal"/>
+    <w:basedOn w:val="Tablanormal"/>
     <w:uiPriority w:val="69"/>
     <w:rsid w:val="00CB0664"/>
     <w:pPr>
@@ -10421,9 +10567,9 @@
       </w:tcPr>
     </w:tblStylePr>
   </w:style>
-  <w:style w:type="table" w:styleId="MediumGrid3-Accent1">
+  <w:style w:type="table" w:styleId="Cuadrculamedia3-nfasis1">
     <w:name w:val="Medium Grid 3 Accent 1"/>
-    <w:basedOn w:val="TableNormal"/>
+    <w:basedOn w:val="Tablanormal"/>
     <w:uiPriority w:val="69"/>
     <w:rsid w:val="00CB0664"/>
     <w:pPr>
@@ -10555,9 +10701,9 @@
       </w:tcPr>
     </w:tblStylePr>
   </w:style>
-  <w:style w:type="table" w:styleId="MediumGrid3-Accent2">
+  <w:style w:type="table" w:styleId="Cuadrculamedia3-nfasis2">
     <w:name w:val="Medium Grid 3 Accent 2"/>
-    <w:basedOn w:val="TableNormal"/>
+    <w:basedOn w:val="Tablanormal"/>
     <w:uiPriority w:val="69"/>
     <w:rsid w:val="00CB0664"/>
     <w:pPr>
@@ -10689,9 +10835,9 @@
       </w:tcPr>
     </w:tblStylePr>
   </w:style>
-  <w:style w:type="table" w:styleId="MediumGrid3-Accent3">
+  <w:style w:type="table" w:styleId="Cuadrculamedia3-nfasis3">
     <w:name w:val="Medium Grid 3 Accent 3"/>
-    <w:basedOn w:val="TableNormal"/>
+    <w:basedOn w:val="Tablanormal"/>
     <w:uiPriority w:val="69"/>
     <w:rsid w:val="00CB0664"/>
     <w:pPr>
@@ -10823,9 +10969,9 @@
       </w:tcPr>
     </w:tblStylePr>
   </w:style>
-  <w:style w:type="table" w:styleId="MediumGrid3-Accent4">
+  <w:style w:type="table" w:styleId="Cuadrculamedia3-nfasis4">
     <w:name w:val="Medium Grid 3 Accent 4"/>
-    <w:basedOn w:val="TableNormal"/>
+    <w:basedOn w:val="Tablanormal"/>
     <w:uiPriority w:val="69"/>
     <w:rsid w:val="00CB0664"/>
     <w:pPr>
@@ -10957,9 +11103,9 @@
       </w:tcPr>
     </w:tblStylePr>
   </w:style>
-  <w:style w:type="table" w:styleId="MediumGrid3-Accent5">
+  <w:style w:type="table" w:styleId="Cuadrculamedia3-nfasis5">
     <w:name w:val="Medium Grid 3 Accent 5"/>
-    <w:basedOn w:val="TableNormal"/>
+    <w:basedOn w:val="Tablanormal"/>
     <w:uiPriority w:val="69"/>
     <w:rsid w:val="00CB0664"/>
     <w:pPr>
@@ -11091,9 +11237,9 @@
       </w:tcPr>
     </w:tblStylePr>
   </w:style>
-  <w:style w:type="table" w:styleId="MediumGrid3-Accent6">
+  <w:style w:type="table" w:styleId="Cuadrculamedia3-nfasis6">
     <w:name w:val="Medium Grid 3 Accent 6"/>
-    <w:basedOn w:val="TableNormal"/>
+    <w:basedOn w:val="Tablanormal"/>
     <w:uiPriority w:val="69"/>
     <w:rsid w:val="00CB0664"/>
     <w:pPr>
@@ -11225,9 +11371,9 @@
       </w:tcPr>
     </w:tblStylePr>
   </w:style>
-  <w:style w:type="table" w:styleId="DarkList">
+  <w:style w:type="table" w:styleId="Listaoscura">
     <w:name w:val="Dark List"/>
-    <w:basedOn w:val="TableNormal"/>
+    <w:basedOn w:val="Tablanormal"/>
     <w:uiPriority w:val="70"/>
     <w:rsid w:val="00CB0664"/>
     <w:pPr>
@@ -11332,9 +11478,9 @@
       </w:tcPr>
     </w:tblStylePr>
   </w:style>
-  <w:style w:type="table" w:styleId="DarkList-Accent1">
+  <w:style w:type="table" w:styleId="Listaoscura-nfasis1">
     <w:name w:val="Dark List Accent 1"/>
-    <w:basedOn w:val="TableNormal"/>
+    <w:basedOn w:val="Tablanormal"/>
     <w:uiPriority w:val="70"/>
     <w:rsid w:val="00CB0664"/>
     <w:pPr>
@@ -11439,9 +11585,9 @@
       </w:tcPr>
     </w:tblStylePr>
   </w:style>
-  <w:style w:type="table" w:styleId="DarkList-Accent2">
+  <w:style w:type="table" w:styleId="Listaoscura-nfasis2">
     <w:name w:val="Dark List Accent 2"/>
-    <w:basedOn w:val="TableNormal"/>
+    <w:basedOn w:val="Tablanormal"/>
     <w:uiPriority w:val="70"/>
     <w:rsid w:val="00CB0664"/>
     <w:pPr>
@@ -11546,9 +11692,9 @@
       </w:tcPr>
     </w:tblStylePr>
   </w:style>
-  <w:style w:type="table" w:styleId="DarkList-Accent3">
+  <w:style w:type="table" w:styleId="Listaoscura-nfasis3">
     <w:name w:val="Dark List Accent 3"/>
-    <w:basedOn w:val="TableNormal"/>
+    <w:basedOn w:val="Tablanormal"/>
     <w:uiPriority w:val="70"/>
     <w:rsid w:val="00CB0664"/>
     <w:pPr>
@@ -11653,9 +11799,9 @@
       </w:tcPr>
     </w:tblStylePr>
   </w:style>
-  <w:style w:type="table" w:styleId="DarkList-Accent4">
+  <w:style w:type="table" w:styleId="Listaoscura-nfasis4">
     <w:name w:val="Dark List Accent 4"/>
-    <w:basedOn w:val="TableNormal"/>
+    <w:basedOn w:val="Tablanormal"/>
     <w:uiPriority w:val="70"/>
     <w:rsid w:val="00CB0664"/>
     <w:pPr>
@@ -11760,9 +11906,9 @@
       </w:tcPr>
     </w:tblStylePr>
   </w:style>
-  <w:style w:type="table" w:styleId="DarkList-Accent5">
+  <w:style w:type="table" w:styleId="Listaoscura-nfasis5">
     <w:name w:val="Dark List Accent 5"/>
-    <w:basedOn w:val="TableNormal"/>
+    <w:basedOn w:val="Tablanormal"/>
     <w:uiPriority w:val="70"/>
     <w:rsid w:val="00CB0664"/>
     <w:pPr>
@@ -11867,9 +12013,9 @@
       </w:tcPr>
     </w:tblStylePr>
   </w:style>
-  <w:style w:type="table" w:styleId="DarkList-Accent6">
+  <w:style w:type="table" w:styleId="Listaoscura-nfasis6">
     <w:name w:val="Dark List Accent 6"/>
-    <w:basedOn w:val="TableNormal"/>
+    <w:basedOn w:val="Tablanormal"/>
     <w:uiPriority w:val="70"/>
     <w:rsid w:val="00CB0664"/>
     <w:pPr>
@@ -11974,9 +12120,9 @@
       </w:tcPr>
     </w:tblStylePr>
   </w:style>
-  <w:style w:type="table" w:styleId="ColorfulShading">
+  <w:style w:type="table" w:styleId="Sombreadovistoso">
     <w:name w:val="Colorful Shading"/>
-    <w:basedOn w:val="TableNormal"/>
+    <w:basedOn w:val="Tablanormal"/>
     <w:uiPriority w:val="71"/>
     <w:rsid w:val="00CB0664"/>
     <w:pPr>
@@ -12089,9 +12235,9 @@
       </w:rPr>
     </w:tblStylePr>
   </w:style>
-  <w:style w:type="table" w:styleId="ColorfulShading-Accent1">
+  <w:style w:type="table" w:styleId="Sombreadovistoso-nfasis1">
     <w:name w:val="Colorful Shading Accent 1"/>
-    <w:basedOn w:val="TableNormal"/>
+    <w:basedOn w:val="Tablanormal"/>
     <w:uiPriority w:val="71"/>
     <w:rsid w:val="00CB0664"/>
     <w:pPr>
@@ -12204,9 +12350,9 @@
       </w:rPr>
     </w:tblStylePr>
   </w:style>
-  <w:style w:type="table" w:styleId="ColorfulShading-Accent2">
+  <w:style w:type="table" w:styleId="Sombreadovistoso-nfasis2">
     <w:name w:val="Colorful Shading Accent 2"/>
-    <w:basedOn w:val="TableNormal"/>
+    <w:basedOn w:val="Tablanormal"/>
     <w:uiPriority w:val="71"/>
     <w:rsid w:val="00CB0664"/>
     <w:pPr>
@@ -12319,9 +12465,9 @@
       </w:rPr>
     </w:tblStylePr>
   </w:style>
-  <w:style w:type="table" w:styleId="ColorfulShading-Accent3">
+  <w:style w:type="table" w:styleId="Sombreadovistoso-nfasis3">
     <w:name w:val="Colorful Shading Accent 3"/>
-    <w:basedOn w:val="TableNormal"/>
+    <w:basedOn w:val="Tablanormal"/>
     <w:uiPriority w:val="71"/>
     <w:rsid w:val="00CB0664"/>
     <w:pPr>
@@ -12424,9 +12570,9 @@
       </w:tcPr>
     </w:tblStylePr>
   </w:style>
-  <w:style w:type="table" w:styleId="ColorfulShading-Accent4">
+  <w:style w:type="table" w:styleId="Sombreadovistoso-nfasis4">
     <w:name w:val="Colorful Shading Accent 4"/>
-    <w:basedOn w:val="TableNormal"/>
+    <w:basedOn w:val="Tablanormal"/>
     <w:uiPriority w:val="71"/>
     <w:rsid w:val="00CB0664"/>
     <w:pPr>
@@ -12539,9 +12685,9 @@
       </w:rPr>
     </w:tblStylePr>
   </w:style>
-  <w:style w:type="table" w:styleId="ColorfulShading-Accent5">
+  <w:style w:type="table" w:styleId="Sombreadovistoso-nfasis5">
     <w:name w:val="Colorful Shading Accent 5"/>
-    <w:basedOn w:val="TableNormal"/>
+    <w:basedOn w:val="Tablanormal"/>
     <w:uiPriority w:val="71"/>
     <w:rsid w:val="00CB0664"/>
     <w:pPr>
@@ -12654,9 +12800,9 @@
       </w:rPr>
     </w:tblStylePr>
   </w:style>
-  <w:style w:type="table" w:styleId="ColorfulShading-Accent6">
+  <w:style w:type="table" w:styleId="Sombreadovistoso-nfasis6">
     <w:name w:val="Colorful Shading Accent 6"/>
-    <w:basedOn w:val="TableNormal"/>
+    <w:basedOn w:val="Tablanormal"/>
     <w:uiPriority w:val="71"/>
     <w:rsid w:val="00CB0664"/>
     <w:pPr>
@@ -12769,9 +12915,9 @@
       </w:rPr>
     </w:tblStylePr>
   </w:style>
-  <w:style w:type="table" w:styleId="ColorfulList">
+  <w:style w:type="table" w:styleId="Listavistosa">
     <w:name w:val="Colorful List"/>
-    <w:basedOn w:val="TableNormal"/>
+    <w:basedOn w:val="Tablanormal"/>
     <w:uiPriority w:val="72"/>
     <w:rsid w:val="00CB0664"/>
     <w:pPr>
@@ -12848,9 +12994,9 @@
       </w:tcPr>
     </w:tblStylePr>
   </w:style>
-  <w:style w:type="table" w:styleId="ColorfulList-Accent1">
+  <w:style w:type="table" w:styleId="Listavistosa-nfasis1">
     <w:name w:val="Colorful List Accent 1"/>
-    <w:basedOn w:val="TableNormal"/>
+    <w:basedOn w:val="Tablanormal"/>
     <w:uiPriority w:val="72"/>
     <w:rsid w:val="00CB0664"/>
     <w:pPr>
@@ -12927,9 +13073,9 @@
       </w:tcPr>
     </w:tblStylePr>
   </w:style>
-  <w:style w:type="table" w:styleId="ColorfulList-Accent2">
+  <w:style w:type="table" w:styleId="Listavistosa-nfasis2">
     <w:name w:val="Colorful List Accent 2"/>
-    <w:basedOn w:val="TableNormal"/>
+    <w:basedOn w:val="Tablanormal"/>
     <w:uiPriority w:val="72"/>
     <w:rsid w:val="00CB0664"/>
     <w:pPr>
@@ -13006,9 +13152,9 @@
       </w:tcPr>
     </w:tblStylePr>
   </w:style>
-  <w:style w:type="table" w:styleId="ColorfulList-Accent3">
+  <w:style w:type="table" w:styleId="Listavistosa-nfasis3">
     <w:name w:val="Colorful List Accent 3"/>
-    <w:basedOn w:val="TableNormal"/>
+    <w:basedOn w:val="Tablanormal"/>
     <w:uiPriority w:val="72"/>
     <w:rsid w:val="00CB0664"/>
     <w:pPr>
@@ -13085,9 +13231,9 @@
       </w:tcPr>
     </w:tblStylePr>
   </w:style>
-  <w:style w:type="table" w:styleId="ColorfulList-Accent4">
+  <w:style w:type="table" w:styleId="Listavistosa-nfasis4">
     <w:name w:val="Colorful List Accent 4"/>
-    <w:basedOn w:val="TableNormal"/>
+    <w:basedOn w:val="Tablanormal"/>
     <w:uiPriority w:val="72"/>
     <w:rsid w:val="00CB0664"/>
     <w:pPr>
@@ -13164,9 +13310,9 @@
       </w:tcPr>
     </w:tblStylePr>
   </w:style>
-  <w:style w:type="table" w:styleId="ColorfulList-Accent5">
+  <w:style w:type="table" w:styleId="Listavistosa-nfasis5">
     <w:name w:val="Colorful List Accent 5"/>
-    <w:basedOn w:val="TableNormal"/>
+    <w:basedOn w:val="Tablanormal"/>
     <w:uiPriority w:val="72"/>
     <w:rsid w:val="00CB0664"/>
     <w:pPr>
@@ -13243,9 +13389,9 @@
       </w:tcPr>
     </w:tblStylePr>
   </w:style>
-  <w:style w:type="table" w:styleId="ColorfulList-Accent6">
+  <w:style w:type="table" w:styleId="Listavistosa-nfasis6">
     <w:name w:val="Colorful List Accent 6"/>
-    <w:basedOn w:val="TableNormal"/>
+    <w:basedOn w:val="Tablanormal"/>
     <w:uiPriority w:val="72"/>
     <w:rsid w:val="00CB0664"/>
     <w:pPr>
@@ -13322,9 +13468,9 @@
       </w:tcPr>
     </w:tblStylePr>
   </w:style>
-  <w:style w:type="table" w:styleId="ColorfulGrid">
+  <w:style w:type="table" w:styleId="Cuadrculavistosa">
     <w:name w:val="Colorful Grid"/>
-    <w:basedOn w:val="TableNormal"/>
+    <w:basedOn w:val="Tablanormal"/>
     <w:uiPriority w:val="73"/>
     <w:rsid w:val="00CB0664"/>
     <w:pPr>
@@ -13395,9 +13541,9 @@
       </w:tcPr>
     </w:tblStylePr>
   </w:style>
-  <w:style w:type="table" w:styleId="ColorfulGrid-Accent1">
+  <w:style w:type="table" w:styleId="Cuadrculavistosa-nfasis1">
     <w:name w:val="Colorful Grid Accent 1"/>
-    <w:basedOn w:val="TableNormal"/>
+    <w:basedOn w:val="Tablanormal"/>
     <w:uiPriority w:val="73"/>
     <w:rsid w:val="00CB0664"/>
     <w:pPr>
@@ -13468,9 +13614,9 @@
       </w:tcPr>
     </w:tblStylePr>
   </w:style>
-  <w:style w:type="table" w:styleId="ColorfulGrid-Accent2">
+  <w:style w:type="table" w:styleId="Cuadrculavistosa-nfasis2">
     <w:name w:val="Colorful Grid Accent 2"/>
-    <w:basedOn w:val="TableNormal"/>
+    <w:basedOn w:val="Tablanormal"/>
     <w:uiPriority w:val="73"/>
     <w:rsid w:val="00CB0664"/>
     <w:pPr>
@@ -13541,9 +13687,9 @@
       </w:tcPr>
     </w:tblStylePr>
   </w:style>
-  <w:style w:type="table" w:styleId="ColorfulGrid-Accent3">
+  <w:style w:type="table" w:styleId="Cuadrculavistosa-nfasis3">
     <w:name w:val="Colorful Grid Accent 3"/>
-    <w:basedOn w:val="TableNormal"/>
+    <w:basedOn w:val="Tablanormal"/>
     <w:uiPriority w:val="73"/>
     <w:rsid w:val="00CB0664"/>
     <w:pPr>
@@ -13614,9 +13760,9 @@
       </w:tcPr>
     </w:tblStylePr>
   </w:style>
-  <w:style w:type="table" w:styleId="ColorfulGrid-Accent4">
+  <w:style w:type="table" w:styleId="Cuadrculavistosa-nfasis4">
     <w:name w:val="Colorful Grid Accent 4"/>
-    <w:basedOn w:val="TableNormal"/>
+    <w:basedOn w:val="Tablanormal"/>
     <w:uiPriority w:val="73"/>
     <w:rsid w:val="00CB0664"/>
     <w:pPr>
@@ -13687,9 +13833,9 @@
       </w:tcPr>
     </w:tblStylePr>
   </w:style>
-  <w:style w:type="table" w:styleId="ColorfulGrid-Accent5">
+  <w:style w:type="table" w:styleId="Cuadrculavistosa-nfasis5">
     <w:name w:val="Colorful Grid Accent 5"/>
-    <w:basedOn w:val="TableNormal"/>
+    <w:basedOn w:val="Tablanormal"/>
     <w:uiPriority w:val="73"/>
     <w:rsid w:val="00CB0664"/>
     <w:pPr>
@@ -13760,9 +13906,9 @@
       </w:tcPr>
     </w:tblStylePr>
   </w:style>
-  <w:style w:type="table" w:styleId="ColorfulGrid-Accent6">
+  <w:style w:type="table" w:styleId="Cuadrculavistosa-nfasis6">
     <w:name w:val="Colorful Grid Accent 6"/>
-    <w:basedOn w:val="TableNormal"/>
+    <w:basedOn w:val="Tablanormal"/>
     <w:uiPriority w:val="73"/>
     <w:rsid w:val="00CB0664"/>
     <w:pPr>

</xml_diff>